<commit_message>
Publish output/zh/resume.docx (run 20260817T091259Z-manual)
</commit_message>
<xml_diff>
--- a/output/zh/resume.docx
+++ b/output/zh/resume.docx
@@ -466,7 +466,7 @@
                 <w:color w:val="444444"/>
                 <w:sz w:val="19"/>
               </w:rPr>
-              <w:t>Taipei, Taiwan</w:t>
+              <w:t>台灣台北</w:t>
             </w:r>
           </w:p>
         </w:tc>
@@ -675,7 +675,7 @@
                 <w:color w:val="444444"/>
                 <w:sz w:val="19"/>
               </w:rPr>
-              <w:t>Taipei, Taiwan</w:t>
+              <w:t>台灣台北</w:t>
             </w:r>
           </w:p>
         </w:tc>
@@ -858,7 +858,7 @@
                 <w:color w:val="444444"/>
                 <w:sz w:val="19"/>
               </w:rPr>
-              <w:t>New Taipei City, Taiwan</w:t>
+              <w:t>台灣新北市</w:t>
             </w:r>
           </w:p>
         </w:tc>
@@ -1033,178 +1033,6 @@
                 <w:color w:val="111111"/>
                 <w:sz w:val="21"/>
               </w:rPr>
-              <w:t>AI News Agent — 三情境路由聊天機器人</w:t>
-            </w:r>
-          </w:p>
-        </w:tc>
-        <w:tc>
-          <w:tcPr>
-            <w:tcW w:type="dxa" w:w="5159"/>
-          </w:tcPr>
-          <w:p>
-            <w:pPr>
-              <w:spacing w:before="0" w:after="0"/>
-              <w:jc w:val="right"/>
-            </w:pPr>
-            <w:r>
-              <w:rPr>
-                <w:rFonts w:ascii="Noto Sans CJK TC" w:hAnsi="Noto Sans CJK TC" w:eastAsia="Noto Sans CJK TC"/>
-                <w:b w:val="0"/>
-                <w:i w:val="0"/>
-                <w:color w:val="444444"/>
-                <w:sz w:val="19"/>
-              </w:rPr>
-              <w:t>Cathay Financial Holdings, DDT AI</w:t>
-            </w:r>
-          </w:p>
-        </w:tc>
-      </w:tr>
-    </w:tbl>
-    <w:p>
-      <w:pPr>
-        <w:spacing w:before="20" w:after="0"/>
-        <w:ind w:left="193" w:hanging="193"/>
-      </w:pPr>
-      <w:r>
-        <w:rPr>
-          <w:rFonts w:ascii="Noto Sans CJK TC" w:hAnsi="Noto Sans CJK TC" w:eastAsia="Noto Sans CJK TC"/>
-          <w:b w:val="0"/>
-          <w:i w:val="0"/>
-          <w:color w:val="111111"/>
-          <w:sz w:val="16"/>
-        </w:rPr>
-        <w:t xml:space="preserve">▪ </w:t>
-      </w:r>
-      <w:r>
-        <w:rPr>
-          <w:rFonts w:ascii="Noto Sans CJK TC" w:hAnsi="Noto Sans CJK TC" w:eastAsia="Noto Sans CJK TC"/>
-          <w:b w:val="0"/>
-          <w:i w:val="0"/>
-          <w:color w:val="111111"/>
-          <w:sz w:val="19"/>
-        </w:rPr>
-        <w:t>以四層架構（介面 / 應用 / 資料 / 外部服務）打造內部 AI 研究報告查詢助理。</w:t>
-      </w:r>
-    </w:p>
-    <w:p>
-      <w:pPr>
-        <w:spacing w:before="40" w:after="0"/>
-        <w:ind w:left="193" w:hanging="193"/>
-      </w:pPr>
-      <w:r>
-        <w:rPr>
-          <w:rFonts w:ascii="Noto Sans CJK TC" w:hAnsi="Noto Sans CJK TC" w:eastAsia="Noto Sans CJK TC"/>
-          <w:b w:val="0"/>
-          <w:i w:val="0"/>
-          <w:color w:val="111111"/>
-          <w:sz w:val="16"/>
-        </w:rPr>
-        <w:t xml:space="preserve">▪ </w:t>
-      </w:r>
-      <w:r>
-        <w:rPr>
-          <w:rFonts w:ascii="Noto Sans CJK TC" w:hAnsi="Noto Sans CJK TC" w:eastAsia="Noto Sans CJK TC"/>
-          <w:b w:val="0"/>
-          <w:i w:val="0"/>
-          <w:color w:val="111111"/>
-          <w:sz w:val="19"/>
-        </w:rPr>
-        <w:t>設計三情境分類系統（LLM 意圖偵測 + Python 狀態機），對明確、模糊與超出範圍的提問進行智慧路由。</w:t>
-      </w:r>
-    </w:p>
-    <w:p>
-      <w:pPr>
-        <w:spacing w:before="40" w:after="0"/>
-        <w:ind w:left="193" w:hanging="193"/>
-      </w:pPr>
-      <w:r>
-        <w:rPr>
-          <w:rFonts w:ascii="Noto Sans CJK TC" w:hAnsi="Noto Sans CJK TC" w:eastAsia="Noto Sans CJK TC"/>
-          <w:b w:val="0"/>
-          <w:i w:val="0"/>
-          <w:color w:val="111111"/>
-          <w:sz w:val="16"/>
-        </w:rPr>
-        <w:t xml:space="preserve">▪ </w:t>
-      </w:r>
-      <w:r>
-        <w:rPr>
-          <w:rFonts w:ascii="Noto Sans CJK TC" w:hAnsi="Noto Sans CJK TC" w:eastAsia="Noto Sans CJK TC"/>
-          <w:b w:val="0"/>
-          <w:i w:val="0"/>
-          <w:color w:val="111111"/>
-          <w:sz w:val="19"/>
-        </w:rPr>
-        <w:t>以 Lambda 非同步自呼叫突破 LINE Webhook 一秒逾時限制，支援 5–15 秒的 LLM 推論 + RAG 檢索流程。</w:t>
-      </w:r>
-    </w:p>
-    <w:p>
-      <w:pPr>
-        <w:spacing w:before="40" w:after="0"/>
-        <w:ind w:left="193" w:hanging="193"/>
-      </w:pPr>
-      <w:r>
-        <w:rPr>
-          <w:rFonts w:ascii="Noto Sans CJK TC" w:hAnsi="Noto Sans CJK TC" w:eastAsia="Noto Sans CJK TC"/>
-          <w:b w:val="0"/>
-          <w:i w:val="0"/>
-          <w:color w:val="111111"/>
-          <w:sz w:val="16"/>
-        </w:rPr>
-        <w:t xml:space="preserve">▪ </w:t>
-      </w:r>
-      <w:r>
-        <w:rPr>
-          <w:rFonts w:ascii="Noto Sans CJK TC" w:hAnsi="Noto Sans CJK TC" w:eastAsia="Noto Sans CJK TC"/>
-          <w:b w:val="0"/>
-          <w:i w:val="0"/>
-          <w:color w:val="111111"/>
-          <w:sz w:val="19"/>
-        </w:rPr>
-        <w:t>建置完整 ETL 流程（Google Sheets → Bedrock Embedding → OpenSearch），並依主題、來源、日期與訂閱層級做多維度篩選。</w:t>
-      </w:r>
-    </w:p>
-    <w:p>
-      <w:pPr>
-        <w:spacing w:after="140"/>
-      </w:pPr>
-    </w:p>
-    <w:tbl>
-      <w:tblPr>
-        <w:tblW w:type="auto" w:w="0"/>
-        <w:jc w:val="left"/>
-        <w:tblLayout w:type="autofit"/>
-        <w:tblLook w:firstColumn="1" w:firstRow="1" w:lastColumn="0" w:lastRow="0" w:noHBand="0" w:noVBand="1" w:val="04A0"/>
-        <w:tblBorders>
-          <w:top w:val="none" w:sz="0"/>
-          <w:left w:val="none" w:sz="0"/>
-          <w:bottom w:val="none" w:sz="0"/>
-          <w:right w:val="none" w:sz="0"/>
-          <w:insideH w:val="none" w:sz="0"/>
-          <w:insideV w:val="none" w:sz="0"/>
-        </w:tblBorders>
-      </w:tblPr>
-      <w:tblGrid>
-        <w:gridCol w:w="5159"/>
-        <w:gridCol w:w="5159"/>
-      </w:tblGrid>
-      <w:tr>
-        <w:tc>
-          <w:tcPr>
-            <w:tcW w:type="dxa" w:w="5159"/>
-          </w:tcPr>
-          <w:p>
-            <w:pPr>
-              <w:spacing w:before="0" w:after="0"/>
-            </w:pPr>
-            <w:r>
-              <w:rPr>
-                <w:rFonts w:ascii="Noto Sans CJK TC" w:hAnsi="Noto Sans CJK TC" w:eastAsia="Noto Sans CJK TC"/>
-                <w:b/>
-                <w:i w:val="0"/>
-                <w:color w:val="111111"/>
-                <w:sz w:val="21"/>
-              </w:rPr>
               <w:t>LLM 推論研究 — Self-Discover-NLI</w:t>
             </w:r>
           </w:p>
@@ -1226,7 +1054,7 @@
                 <w:color w:val="444444"/>
                 <w:sz w:val="19"/>
               </w:rPr>
-              <w:t>ROCLING Conference 2025</w:t>
+              <w:t>ROCLING 2025 研討會</w:t>
             </w:r>
           </w:p>
         </w:tc>
@@ -1372,7 +1200,7 @@
                 <w:color w:val="444444"/>
                 <w:sz w:val="19"/>
               </w:rPr>
-              <w:t>Cathay Financial Holdings, DDT AI</w:t>
+              <w:t>國泰金融控股 DDT AI</w:t>
             </w:r>
           </w:p>
         </w:tc>
@@ -1484,6 +1312,594 @@
     </w:p>
     <w:p>
       <w:pPr>
+        <w:spacing w:after="140"/>
+      </w:pPr>
+    </w:p>
+    <w:tbl>
+      <w:tblPr>
+        <w:tblW w:type="auto" w:w="0"/>
+        <w:jc w:val="left"/>
+        <w:tblLayout w:type="autofit"/>
+        <w:tblLook w:firstColumn="1" w:firstRow="1" w:lastColumn="0" w:lastRow="0" w:noHBand="0" w:noVBand="1" w:val="04A0"/>
+        <w:tblBorders>
+          <w:top w:val="none" w:sz="0"/>
+          <w:left w:val="none" w:sz="0"/>
+          <w:bottom w:val="none" w:sz="0"/>
+          <w:right w:val="none" w:sz="0"/>
+          <w:insideH w:val="none" w:sz="0"/>
+          <w:insideV w:val="none" w:sz="0"/>
+        </w:tblBorders>
+      </w:tblPr>
+      <w:tblGrid>
+        <w:gridCol w:w="5159"/>
+        <w:gridCol w:w="5159"/>
+      </w:tblGrid>
+      <w:tr>
+        <w:tc>
+          <w:tcPr>
+            <w:tcW w:type="dxa" w:w="5159"/>
+          </w:tcPr>
+          <w:p>
+            <w:pPr>
+              <w:spacing w:before="0" w:after="0"/>
+            </w:pPr>
+            <w:r>
+              <w:rPr>
+                <w:rFonts w:ascii="Noto Sans CJK TC" w:hAnsi="Noto Sans CJK TC" w:eastAsia="Noto Sans CJK TC"/>
+                <w:b/>
+                <w:i w:val="0"/>
+                <w:color w:val="111111"/>
+                <w:sz w:val="21"/>
+              </w:rPr>
+              <w:t>voice-notion — Slack 語音轉 Notion 機器人雲端原生架構</w:t>
+            </w:r>
+          </w:p>
+        </w:tc>
+        <w:tc>
+          <w:tcPr>
+            <w:tcW w:type="dxa" w:w="5159"/>
+          </w:tcPr>
+          <w:p>
+            <w:pPr>
+              <w:spacing w:before="0" w:after="0"/>
+              <w:jc w:val="right"/>
+            </w:pPr>
+            <w:r>
+              <w:rPr>
+                <w:rFonts w:ascii="Noto Sans CJK TC" w:hAnsi="Noto Sans CJK TC" w:eastAsia="Noto Sans CJK TC"/>
+                <w:b w:val="0"/>
+                <w:i w:val="0"/>
+                <w:color w:val="444444"/>
+                <w:sz w:val="19"/>
+              </w:rPr>
+              <w:t>AWS（ap-northeast-1 + us-east-1）</w:t>
+            </w:r>
+          </w:p>
+        </w:tc>
+      </w:tr>
+    </w:tbl>
+    <w:p>
+      <w:pPr>
+        <w:spacing w:before="20" w:after="0"/>
+        <w:ind w:left="193" w:hanging="193"/>
+      </w:pPr>
+      <w:r>
+        <w:rPr>
+          <w:rFonts w:ascii="Noto Sans CJK TC" w:hAnsi="Noto Sans CJK TC" w:eastAsia="Noto Sans CJK TC"/>
+          <w:b w:val="0"/>
+          <w:i w:val="0"/>
+          <w:color w:val="111111"/>
+          <w:sz w:val="16"/>
+        </w:rPr>
+        <w:t xml:space="preserve">▪ </w:t>
+      </w:r>
+      <w:r>
+        <w:rPr>
+          <w:rFonts w:ascii="Noto Sans CJK TC" w:hAnsi="Noto Sans CJK TC" w:eastAsia="Noto Sans CJK TC"/>
+          <w:b w:val="0"/>
+          <w:i w:val="0"/>
+          <w:color w:val="111111"/>
+          <w:sz w:val="19"/>
+        </w:rPr>
+        <w:t>將單一實例的 Next.js 服務重新架構為雲端原生 ECS Fargate 部署，搭配 DynamoDB、SQS 與 EventBridge，實現水平擴充與零資料遺失的滾動更新</w:t>
+      </w:r>
+    </w:p>
+    <w:p>
+      <w:pPr>
+        <w:spacing w:before="40" w:after="0"/>
+        <w:ind w:left="193" w:hanging="193"/>
+      </w:pPr>
+      <w:r>
+        <w:rPr>
+          <w:rFonts w:ascii="Noto Sans CJK TC" w:hAnsi="Noto Sans CJK TC" w:eastAsia="Noto Sans CJK TC"/>
+          <w:b w:val="0"/>
+          <w:i w:val="0"/>
+          <w:color w:val="111111"/>
+          <w:sz w:val="16"/>
+        </w:rPr>
+        <w:t xml:space="preserve">▪ </w:t>
+      </w:r>
+      <w:r>
+        <w:rPr>
+          <w:rFonts w:ascii="Noto Sans CJK TC" w:hAnsi="Noto Sans CJK TC" w:eastAsia="Noto Sans CJK TC"/>
+          <w:b w:val="0"/>
+          <w:i w:val="0"/>
+          <w:color w:val="111111"/>
+          <w:sz w:val="19"/>
+        </w:rPr>
+        <w:t>開發 Slack bot，將語音或文字 @mention 轉換為可確認的 Notion 頁面與任務，並提供每日自動 standup 摘要</w:t>
+      </w:r>
+    </w:p>
+    <w:p>
+      <w:pPr>
+        <w:spacing w:before="40" w:after="0"/>
+        <w:ind w:left="193" w:hanging="193"/>
+      </w:pPr>
+      <w:r>
+        <w:rPr>
+          <w:rFonts w:ascii="Noto Sans CJK TC" w:hAnsi="Noto Sans CJK TC" w:eastAsia="Noto Sans CJK TC"/>
+          <w:b w:val="0"/>
+          <w:i w:val="0"/>
+          <w:color w:val="111111"/>
+          <w:sz w:val="16"/>
+        </w:rPr>
+        <w:t xml:space="preserve">▪ </w:t>
+      </w:r>
+      <w:r>
+        <w:rPr>
+          <w:rFonts w:ascii="Noto Sans CJK TC" w:hAnsi="Noto Sans CJK TC" w:eastAsia="Noto Sans CJK TC"/>
+          <w:b w:val="0"/>
+          <w:i w:val="0"/>
+          <w:color w:val="111111"/>
+          <w:sz w:val="19"/>
+        </w:rPr>
+        <w:t>以同一個 image 在單一 Fargate task 中執行 web 與 worker 容器，僅以啟動指令區分角色（node server.js / node dist/worker.js）</w:t>
+      </w:r>
+    </w:p>
+    <w:p>
+      <w:pPr>
+        <w:spacing w:before="40" w:after="0"/>
+        <w:ind w:left="193" w:hanging="193"/>
+      </w:pPr>
+      <w:r>
+        <w:rPr>
+          <w:rFonts w:ascii="Noto Sans CJK TC" w:hAnsi="Noto Sans CJK TC" w:eastAsia="Noto Sans CJK TC"/>
+          <w:b w:val="0"/>
+          <w:i w:val="0"/>
+          <w:color w:val="111111"/>
+          <w:sz w:val="16"/>
+        </w:rPr>
+        <w:t xml:space="preserve">▪ </w:t>
+      </w:r>
+      <w:r>
+        <w:rPr>
+          <w:rFonts w:ascii="Noto Sans CJK TC" w:hAnsi="Noto Sans CJK TC" w:eastAsia="Noto Sans CJK TC"/>
+          <w:b w:val="0"/>
+          <w:i w:val="0"/>
+          <w:color w:val="111111"/>
+          <w:sz w:val="19"/>
+        </w:rPr>
+        <w:t>拆分 webhook 處理流程：web 負責驗證簽章、送入 SQS 並於 3 秒內回傳 200，worker 負責耗時 30–120 秒的轉寫與 LLM 處理</w:t>
+      </w:r>
+    </w:p>
+    <w:p>
+      <w:pPr>
+        <w:spacing w:before="40" w:after="0"/>
+        <w:ind w:left="193" w:hanging="193"/>
+      </w:pPr>
+      <w:r>
+        <w:rPr>
+          <w:rFonts w:ascii="Noto Sans CJK TC" w:hAnsi="Noto Sans CJK TC" w:eastAsia="Noto Sans CJK TC"/>
+          <w:b w:val="0"/>
+          <w:i w:val="0"/>
+          <w:color w:val="111111"/>
+          <w:sz w:val="16"/>
+        </w:rPr>
+        <w:t xml:space="preserve">▪ </w:t>
+      </w:r>
+      <w:r>
+        <w:rPr>
+          <w:rFonts w:ascii="Noto Sans CJK TC" w:hAnsi="Noto Sans CJK TC" w:eastAsia="Noto Sans CJK TC"/>
+          <w:b w:val="0"/>
+          <w:i w:val="0"/>
+          <w:color w:val="111111"/>
+          <w:sz w:val="19"/>
+        </w:rPr>
+        <w:t>以 DynamoDB single-table 設計（PK/SK、TTL）取代 6 個記憶體內狀態儲存，使狀態可在 task 重啟後保留並於容器間共用</w:t>
+      </w:r>
+    </w:p>
+    <w:p>
+      <w:pPr>
+        <w:spacing w:before="40" w:after="0"/>
+        <w:ind w:left="193" w:hanging="193"/>
+      </w:pPr>
+      <w:r>
+        <w:rPr>
+          <w:rFonts w:ascii="Noto Sans CJK TC" w:hAnsi="Noto Sans CJK TC" w:eastAsia="Noto Sans CJK TC"/>
+          <w:b w:val="0"/>
+          <w:i w:val="0"/>
+          <w:color w:val="111111"/>
+          <w:sz w:val="16"/>
+        </w:rPr>
+        <w:t xml:space="preserve">▪ </w:t>
+      </w:r>
+      <w:r>
+        <w:rPr>
+          <w:rFonts w:ascii="Noto Sans CJK TC" w:hAnsi="Noto Sans CJK TC" w:eastAsia="Noto Sans CJK TC"/>
+          <w:b w:val="0"/>
+          <w:i w:val="0"/>
+          <w:color w:val="111111"/>
+          <w:sz w:val="19"/>
+        </w:rPr>
+        <w:t>使用 UpdateItem 搭配 ConditionExpression（claimDraft）與 PutItem 搭配 attribute_not_exists 實作原子操作，避免跨容器重複送出</w:t>
+      </w:r>
+    </w:p>
+    <w:p>
+      <w:pPr>
+        <w:spacing w:before="40" w:after="0"/>
+        <w:ind w:left="193" w:hanging="193"/>
+      </w:pPr>
+      <w:r>
+        <w:rPr>
+          <w:rFonts w:ascii="Noto Sans CJK TC" w:hAnsi="Noto Sans CJK TC" w:eastAsia="Noto Sans CJK TC"/>
+          <w:b w:val="0"/>
+          <w:i w:val="0"/>
+          <w:color w:val="111111"/>
+          <w:sz w:val="16"/>
+        </w:rPr>
+        <w:t xml:space="preserve">▪ </w:t>
+      </w:r>
+      <w:r>
+        <w:rPr>
+          <w:rFonts w:ascii="Noto Sans CJK TC" w:hAnsi="Noto Sans CJK TC" w:eastAsia="Noto Sans CJK TC"/>
+          <w:b w:val="0"/>
+          <w:i w:val="0"/>
+          <w:color w:val="111111"/>
+          <w:sz w:val="19"/>
+        </w:rPr>
+        <w:t>設定 SQS 主佇列與 DLQ，VisibilityTimeout=180、maxReceiveCount=3，以保存、重試並隔離 poison message</w:t>
+      </w:r>
+    </w:p>
+    <w:p>
+      <w:pPr>
+        <w:spacing w:before="40" w:after="0"/>
+        <w:ind w:left="193" w:hanging="193"/>
+      </w:pPr>
+      <w:r>
+        <w:rPr>
+          <w:rFonts w:ascii="Noto Sans CJK TC" w:hAnsi="Noto Sans CJK TC" w:eastAsia="Noto Sans CJK TC"/>
+          <w:b w:val="0"/>
+          <w:i w:val="0"/>
+          <w:color w:val="111111"/>
+          <w:sz w:val="16"/>
+        </w:rPr>
+        <w:t xml:space="preserve">▪ </w:t>
+      </w:r>
+      <w:r>
+        <w:rPr>
+          <w:rFonts w:ascii="Noto Sans CJK TC" w:hAnsi="Noto Sans CJK TC" w:eastAsia="Noto Sans CJK TC"/>
+          <w:b w:val="0"/>
+          <w:i w:val="0"/>
+          <w:color w:val="111111"/>
+          <w:sz w:val="19"/>
+        </w:rPr>
+        <w:t>以 ffmpeg（16k 單聲道 16-bit LPCM、3200B/100ms 分塊）建立語音轉文字 pipeline，串接 Amazon Transcribe streaming 並啟用 zh-TW+en-US 多語言辨識</w:t>
+      </w:r>
+    </w:p>
+    <w:p>
+      <w:pPr>
+        <w:spacing w:before="40" w:after="0"/>
+        <w:ind w:left="193" w:hanging="193"/>
+      </w:pPr>
+      <w:r>
+        <w:rPr>
+          <w:rFonts w:ascii="Noto Sans CJK TC" w:hAnsi="Noto Sans CJK TC" w:eastAsia="Noto Sans CJK TC"/>
+          <w:b w:val="0"/>
+          <w:i w:val="0"/>
+          <w:color w:val="111111"/>
+          <w:sz w:val="16"/>
+        </w:rPr>
+        <w:t xml:space="preserve">▪ </w:t>
+      </w:r>
+      <w:r>
+        <w:rPr>
+          <w:rFonts w:ascii="Noto Sans CJK TC" w:hAnsi="Noto Sans CJK TC" w:eastAsia="Noto Sans CJK TC"/>
+          <w:b w:val="0"/>
+          <w:i w:val="0"/>
+          <w:color w:val="111111"/>
+          <w:sz w:val="19"/>
+        </w:rPr>
+        <w:t>建立自訂 Transcribe vocabulary（voice-notion-zhtw / voice-notion-enus），由 lib/vocabulary.ts 與 MEMBERS_JSON 同步，提升成員姓名與專案術語的辨識率</w:t>
+      </w:r>
+    </w:p>
+    <w:p>
+      <w:pPr>
+        <w:spacing w:before="40" w:after="0"/>
+        <w:ind w:left="193" w:hanging="193"/>
+      </w:pPr>
+      <w:r>
+        <w:rPr>
+          <w:rFonts w:ascii="Noto Sans CJK TC" w:hAnsi="Noto Sans CJK TC" w:eastAsia="Noto Sans CJK TC"/>
+          <w:b w:val="0"/>
+          <w:i w:val="0"/>
+          <w:color w:val="111111"/>
+          <w:sz w:val="16"/>
+        </w:rPr>
+        <w:t xml:space="preserve">▪ </w:t>
+      </w:r>
+      <w:r>
+        <w:rPr>
+          <w:rFonts w:ascii="Noto Sans CJK TC" w:hAnsi="Noto Sans CJK TC" w:eastAsia="Noto Sans CJK TC"/>
+          <w:b w:val="0"/>
+          <w:i w:val="0"/>
+          <w:color w:val="111111"/>
+          <w:sz w:val="19"/>
+        </w:rPr>
+        <w:t>透過 us-east-1 的 AnthropicBedrockMantle client 整合 Bedrock Claude Opus 4.8，使用 ECS task role SigV4 驗證，無需 API key</w:t>
+      </w:r>
+    </w:p>
+    <w:p>
+      <w:pPr>
+        <w:spacing w:before="40" w:after="0"/>
+        <w:ind w:left="193" w:hanging="193"/>
+      </w:pPr>
+      <w:r>
+        <w:rPr>
+          <w:rFonts w:ascii="Noto Sans CJK TC" w:hAnsi="Noto Sans CJK TC" w:eastAsia="Noto Sans CJK TC"/>
+          <w:b w:val="0"/>
+          <w:i w:val="0"/>
+          <w:color w:val="111111"/>
+          <w:sz w:val="16"/>
+        </w:rPr>
+        <w:t xml:space="preserve">▪ </w:t>
+      </w:r>
+      <w:r>
+        <w:rPr>
+          <w:rFonts w:ascii="Noto Sans CJK TC" w:hAnsi="Noto Sans CJK TC" w:eastAsia="Noto Sans CJK TC"/>
+          <w:b w:val="0"/>
+          <w:i w:val="0"/>
+          <w:color w:val="111111"/>
+          <w:sz w:val="19"/>
+        </w:rPr>
+        <w:t>因 Bedrock Nova 2 Sonic 為 speech-to-speech 模型，三次嘗試皆回傳 transcriptLength:0，將語音辨識改用 Amazon Transcribe</w:t>
+      </w:r>
+    </w:p>
+    <w:p>
+      <w:pPr>
+        <w:spacing w:before="40" w:after="0"/>
+        <w:ind w:left="193" w:hanging="193"/>
+      </w:pPr>
+      <w:r>
+        <w:rPr>
+          <w:rFonts w:ascii="Noto Sans CJK TC" w:hAnsi="Noto Sans CJK TC" w:eastAsia="Noto Sans CJK TC"/>
+          <w:b w:val="0"/>
+          <w:i w:val="0"/>
+          <w:color w:val="111111"/>
+          <w:sz w:val="16"/>
+        </w:rPr>
+        <w:t xml:space="preserve">▪ </w:t>
+      </w:r>
+      <w:r>
+        <w:rPr>
+          <w:rFonts w:ascii="Noto Sans CJK TC" w:hAnsi="Noto Sans CJK TC" w:eastAsia="Noto Sans CJK TC"/>
+          <w:b w:val="0"/>
+          <w:i w:val="0"/>
+          <w:color w:val="111111"/>
+          <w:sz w:val="19"/>
+        </w:rPr>
+        <w:t>將 cron route 改為送入佇列並立即回傳 200，並設定 EventBridge target MaximumRetryAttempts=0，解決 standup 重試風暴並消除重複摘要</w:t>
+      </w:r>
+    </w:p>
+    <w:p>
+      <w:pPr>
+        <w:spacing w:before="40" w:after="0"/>
+        <w:ind w:left="193" w:hanging="193"/>
+      </w:pPr>
+      <w:r>
+        <w:rPr>
+          <w:rFonts w:ascii="Noto Sans CJK TC" w:hAnsi="Noto Sans CJK TC" w:eastAsia="Noto Sans CJK TC"/>
+          <w:b w:val="0"/>
+          <w:i w:val="0"/>
+          <w:color w:val="111111"/>
+          <w:sz w:val="16"/>
+        </w:rPr>
+        <w:t xml:space="preserve">▪ </w:t>
+      </w:r>
+      <w:r>
+        <w:rPr>
+          <w:rFonts w:ascii="Noto Sans CJK TC" w:hAnsi="Noto Sans CJK TC" w:eastAsia="Noto Sans CJK TC"/>
+          <w:b w:val="0"/>
+          <w:i w:val="0"/>
+          <w:color w:val="111111"/>
+          <w:sz w:val="19"/>
+        </w:rPr>
+        <w:t>為符合法規要求（Security Hub ECS.2/ECS.5）調整部署方式，將 task 移至雙 AZ 私有子網路，設定 assignPublicIp=DISABLED、NAT 出口、唯讀 root filesystem 與 ephemeral volume</w:t>
+      </w:r>
+    </w:p>
+    <w:p>
+      <w:pPr>
+        <w:spacing w:before="40" w:after="0"/>
+        <w:ind w:left="193" w:hanging="193"/>
+      </w:pPr>
+      <w:r>
+        <w:rPr>
+          <w:rFonts w:ascii="Noto Sans CJK TC" w:hAnsi="Noto Sans CJK TC" w:eastAsia="Noto Sans CJK TC"/>
+          <w:b w:val="0"/>
+          <w:i w:val="0"/>
+          <w:color w:val="111111"/>
+          <w:sz w:val="16"/>
+        </w:rPr>
+        <w:t xml:space="preserve">▪ </w:t>
+      </w:r>
+      <w:r>
+        <w:rPr>
+          <w:rFonts w:ascii="Noto Sans CJK TC" w:hAnsi="Noto Sans CJK TC" w:eastAsia="Noto Sans CJK TC"/>
+          <w:b w:val="0"/>
+          <w:i w:val="0"/>
+          <w:color w:val="111111"/>
+          <w:sz w:val="19"/>
+        </w:rPr>
+        <w:t>在 443 listener 上新增 Target Group 與 host-based rule（priority 20），沿用現有的 aaron-dev ALB，而非另建 ALB/ACM/Route53</w:t>
+      </w:r>
+    </w:p>
+    <w:p>
+      <w:pPr>
+        <w:spacing w:before="40" w:after="0"/>
+        <w:ind w:left="193" w:hanging="193"/>
+      </w:pPr>
+      <w:r>
+        <w:rPr>
+          <w:rFonts w:ascii="Noto Sans CJK TC" w:hAnsi="Noto Sans CJK TC" w:eastAsia="Noto Sans CJK TC"/>
+          <w:b w:val="0"/>
+          <w:i w:val="0"/>
+          <w:color w:val="111111"/>
+          <w:sz w:val="16"/>
+        </w:rPr>
+        <w:t xml:space="preserve">▪ </w:t>
+      </w:r>
+      <w:r>
+        <w:rPr>
+          <w:rFonts w:ascii="Noto Sans CJK TC" w:hAnsi="Noto Sans CJK TC" w:eastAsia="Noto Sans CJK TC"/>
+          <w:b w:val="0"/>
+          <w:i w:val="0"/>
+          <w:color w:val="111111"/>
+          <w:sz w:val="19"/>
+        </w:rPr>
+        <w:t>將 Notion / Slack token、CRON_SECRET 與 MEMBERS_JSON 以 SSM Parameter Store SecureString 儲存，並於啟動時注入 task</w:t>
+      </w:r>
+    </w:p>
+    <w:p>
+      <w:pPr>
+        <w:spacing w:before="40" w:after="0"/>
+        <w:ind w:left="193" w:hanging="193"/>
+      </w:pPr>
+      <w:r>
+        <w:rPr>
+          <w:rFonts w:ascii="Noto Sans CJK TC" w:hAnsi="Noto Sans CJK TC" w:eastAsia="Noto Sans CJK TC"/>
+          <w:b w:val="0"/>
+          <w:i w:val="0"/>
+          <w:color w:val="111111"/>
+          <w:sz w:val="16"/>
+        </w:rPr>
+        <w:t xml:space="preserve">▪ </w:t>
+      </w:r>
+      <w:r>
+        <w:rPr>
+          <w:rFonts w:ascii="Noto Sans CJK TC" w:hAnsi="Noto Sans CJK TC" w:eastAsia="Noto Sans CJK TC"/>
+          <w:b w:val="0"/>
+          <w:i w:val="0"/>
+          <w:color w:val="111111"/>
+          <w:sz w:val="19"/>
+        </w:rPr>
+        <w:t>將 IAM 拆分為 execution role 與 task role，task role 權限限縮於 DynamoDB/SQS、bedrock:InvokeModel、bedrock-mantle:* 與 transcribe:StartStreamTranscription</w:t>
+      </w:r>
+    </w:p>
+    <w:p>
+      <w:pPr>
+        <w:spacing w:before="40" w:after="0"/>
+        <w:ind w:left="193" w:hanging="193"/>
+      </w:pPr>
+      <w:r>
+        <w:rPr>
+          <w:rFonts w:ascii="Noto Sans CJK TC" w:hAnsi="Noto Sans CJK TC" w:eastAsia="Noto Sans CJK TC"/>
+          <w:b w:val="0"/>
+          <w:i w:val="0"/>
+          <w:color w:val="111111"/>
+          <w:sz w:val="16"/>
+        </w:rPr>
+        <w:t xml:space="preserve">▪ </w:t>
+      </w:r>
+      <w:r>
+        <w:rPr>
+          <w:rFonts w:ascii="Noto Sans CJK TC" w:hAnsi="Noto Sans CJK TC" w:eastAsia="Noto Sans CJK TC"/>
+          <w:b w:val="0"/>
+          <w:i w:val="0"/>
+          <w:color w:val="111111"/>
+          <w:sz w:val="19"/>
+        </w:rPr>
+        <w:t>就常駐 worker、cold start/ffmpeg、HA、維運成本與私有子網路等條件，評估 Lambda + API Gateway、自管 EC2 與 App Runner，並與 ECS Fargate 比較</w:t>
+      </w:r>
+    </w:p>
+    <w:p>
+      <w:pPr>
+        <w:spacing w:before="40" w:after="0"/>
+        <w:ind w:left="193" w:hanging="193"/>
+      </w:pPr>
+      <w:r>
+        <w:rPr>
+          <w:rFonts w:ascii="Noto Sans CJK TC" w:hAnsi="Noto Sans CJK TC" w:eastAsia="Noto Sans CJK TC"/>
+          <w:b w:val="0"/>
+          <w:i w:val="0"/>
+          <w:color w:val="111111"/>
+          <w:sz w:val="16"/>
+        </w:rPr>
+        <w:t xml:space="preserve">▪ </w:t>
+      </w:r>
+      <w:r>
+        <w:rPr>
+          <w:rFonts w:ascii="Noto Sans CJK TC" w:hAnsi="Noto Sans CJK TC" w:eastAsia="Noto Sans CJK TC"/>
+          <w:b w:val="0"/>
+          <w:i w:val="0"/>
+          <w:color w:val="111111"/>
+          <w:sz w:val="19"/>
+        </w:rPr>
+        <w:t>沿用現有 ALB 與 NAT，記錄每月約 $57 的成本估算（不含 AI 使用量），並記錄可透過環境變數切換至 claude-sonnet-4-6 的調整方式</w:t>
+      </w:r>
+    </w:p>
+    <w:p>
+      <w:pPr>
+        <w:spacing w:before="40" w:after="0"/>
+        <w:ind w:left="193" w:hanging="193"/>
+      </w:pPr>
+      <w:r>
+        <w:rPr>
+          <w:rFonts w:ascii="Noto Sans CJK TC" w:hAnsi="Noto Sans CJK TC" w:eastAsia="Noto Sans CJK TC"/>
+          <w:b w:val="0"/>
+          <w:i w:val="0"/>
+          <w:color w:val="111111"/>
+          <w:sz w:val="16"/>
+        </w:rPr>
+        <w:t xml:space="preserve">▪ </w:t>
+      </w:r>
+      <w:r>
+        <w:rPr>
+          <w:rFonts w:ascii="Noto Sans CJK TC" w:hAnsi="Noto Sans CJK TC" w:eastAsia="Noto Sans CJK TC"/>
+          <w:b w:val="0"/>
+          <w:i w:val="0"/>
+          <w:color w:val="111111"/>
+          <w:sz w:val="19"/>
+        </w:rPr>
+        <w:t>撰寫維運 runbook，涵蓋發布、以 task-def revision 回滾、log 追蹤、DLQ redrive、密鑰輪替與擴充</w:t>
+      </w:r>
+    </w:p>
+    <w:p>
+      <w:pPr>
+        <w:spacing w:before="40" w:after="0"/>
+        <w:ind w:left="193" w:hanging="193"/>
+      </w:pPr>
+      <w:r>
+        <w:rPr>
+          <w:rFonts w:ascii="Noto Sans CJK TC" w:hAnsi="Noto Sans CJK TC" w:eastAsia="Noto Sans CJK TC"/>
+          <w:b w:val="0"/>
+          <w:i w:val="0"/>
+          <w:color w:val="111111"/>
+          <w:sz w:val="16"/>
+        </w:rPr>
+        <w:t xml:space="preserve">▪ </w:t>
+      </w:r>
+      <w:r>
+        <w:rPr>
+          <w:rFonts w:ascii="Noto Sans CJK TC" w:hAnsi="Noto Sans CJK TC" w:eastAsia="Noto Sans CJK TC"/>
+          <w:b w:val="0"/>
+          <w:i w:val="0"/>
+          <w:color w:val="111111"/>
+          <w:sz w:val="19"/>
+        </w:rPr>
+        <w:t>將 task definition 由 rev1 迭代至 rev9，每個 revision 對應一個特定問題，例如 Mantle 404、不支援的 output_config、Security Hub 檢查發現與重複的 standup 觸發</w:t>
+      </w:r>
+    </w:p>
+    <w:p>
+      <w:pPr>
         <w:spacing w:before="240" w:after="60"/>
         <w:keepNext/>
         <w:pBdr>
@@ -1572,7 +1988,7 @@
           <w:color w:val="111111"/>
           <w:sz w:val="19"/>
         </w:rPr>
-        <w:t>AWS（Lambda、Bedrock、OpenSearch）</w:t>
+        <w:t>AWS（Lambda、Bedrock、OpenSearch）、Amazon Bedrock（Claude Opus 4.8 via AnthropicBedrockMantle client）、Amazon DynamoDB（single-table design、on-demand、TTL）、Amazon ECR（image storage tagged by git SHA / timestamp）、Amazon EventBridge（classic Rule、cron + API destination with Bearer auth）、Amazon SQS（main queue + DLQ、long-poll consumer）</w:t>
       </w:r>
     </w:p>
     <w:p>
@@ -1622,7 +2038,7 @@
           <w:color w:val="111111"/>
           <w:sz w:val="19"/>
         </w:rPr>
-        <w:t>Microsoft Office</w:t>
+        <w:t>Microsoft Office、AWS CLI（register-task-definition、create-service、update-service、logs tail）、Docker（node:20-slim image with ffmpeg、--no-cache builds）</w:t>
       </w:r>
     </w:p>
     <w:p>

</xml_diff>

<commit_message>
Publish output/zh/resume.docx (run 20260817T092455Z-manual)
</commit_message>
<xml_diff>
--- a/output/zh/resume.docx
+++ b/output/zh/resume.docx
@@ -1054,7 +1054,7 @@
                 <w:color w:val="444444"/>
                 <w:sz w:val="19"/>
               </w:rPr>
-              <w:t>ROCLING 2025 研討會</w:t>
+              <w:t>ROCLING Conference 2025</w:t>
             </w:r>
           </w:p>
         </w:tc>
@@ -1200,7 +1200,7 @@
                 <w:color w:val="444444"/>
                 <w:sz w:val="19"/>
               </w:rPr>
-              <w:t>國泰金融控股 DDT AI</w:t>
+              <w:t>國泰金控 DDT AI</w:t>
             </w:r>
           </w:p>
         </w:tc>
@@ -1351,7 +1351,7 @@
                 <w:color w:val="111111"/>
                 <w:sz w:val="21"/>
               </w:rPr>
-              <w:t>voice-notion — Slack 語音轉 Notion 機器人雲端原生架構</w:t>
+              <w:t>voice-notion — Slack 語音轉 Notion 機器人雲原生架構</w:t>
             </w:r>
           </w:p>
         </w:tc>
@@ -1372,7 +1372,7 @@
                 <w:color w:val="444444"/>
                 <w:sz w:val="19"/>
               </w:rPr>
-              <w:t>AWS（ap-northeast-1 + us-east-1）</w:t>
+              <w:t>國泰金控 DDT AI</w:t>
             </w:r>
           </w:p>
         </w:tc>
@@ -1401,7 +1401,7 @@
           <w:color w:val="111111"/>
           <w:sz w:val="19"/>
         </w:rPr>
-        <w:t>將單一實例的 Next.js 服務重新架構為雲端原生 ECS Fargate 部署，搭配 DynamoDB、SQS 與 EventBridge，實現水平擴充與零資料遺失的滾動更新</w:t>
+        <w:t>開發 Slack bot，將語音或文字 @mentions 轉換為可確認的 Notion 頁面與任務，並提供每日自動化 standup 摘要</w:t>
       </w:r>
     </w:p>
     <w:p>
@@ -1427,7 +1427,7 @@
           <w:color w:val="111111"/>
           <w:sz w:val="19"/>
         </w:rPr>
-        <w:t>開發 Slack bot，將語音或文字 @mention 轉換為可確認的 Notion 頁面與任務，並提供每日自動 standup 摘要</w:t>
+        <w:t>將單一實例的 Next.js 服務重新架構為雲原生 ECS Fargate 部署，搭配 DynamoDB、SQS 與 EventBridge，實現水平擴展與零資料遺失的滾動更新</w:t>
       </w:r>
     </w:p>
     <w:p>
@@ -1453,7 +1453,7 @@
           <w:color w:val="111111"/>
           <w:sz w:val="19"/>
         </w:rPr>
-        <w:t>以同一個 image 在單一 Fargate task 中執行 web 與 worker 容器，僅以啟動指令區分角色（node server.js / node dist/worker.js）</w:t>
+        <w:t>拆分 webhook 處理流程：web 端驗證簽章後送入 SQS 並於 3s 內回傳 200，worker 端則處理耗時 30–120s 的轉錄與 LLM 作業</w:t>
       </w:r>
     </w:p>
     <w:p>
@@ -1479,423 +1479,7 @@
           <w:color w:val="111111"/>
           <w:sz w:val="19"/>
         </w:rPr>
-        <w:t>拆分 webhook 處理流程：web 負責驗證簽章、送入 SQS 並於 3 秒內回傳 200，worker 負責耗時 30–120 秒的轉寫與 LLM 處理</w:t>
-      </w:r>
-    </w:p>
-    <w:p>
-      <w:pPr>
-        <w:spacing w:before="40" w:after="0"/>
-        <w:ind w:left="193" w:hanging="193"/>
-      </w:pPr>
-      <w:r>
-        <w:rPr>
-          <w:rFonts w:ascii="Noto Sans CJK TC" w:hAnsi="Noto Sans CJK TC" w:eastAsia="Noto Sans CJK TC"/>
-          <w:b w:val="0"/>
-          <w:i w:val="0"/>
-          <w:color w:val="111111"/>
-          <w:sz w:val="16"/>
-        </w:rPr>
-        <w:t xml:space="preserve">▪ </w:t>
-      </w:r>
-      <w:r>
-        <w:rPr>
-          <w:rFonts w:ascii="Noto Sans CJK TC" w:hAnsi="Noto Sans CJK TC" w:eastAsia="Noto Sans CJK TC"/>
-          <w:b w:val="0"/>
-          <w:i w:val="0"/>
-          <w:color w:val="111111"/>
-          <w:sz w:val="19"/>
-        </w:rPr>
-        <w:t>以 DynamoDB single-table 設計（PK/SK、TTL）取代 6 個記憶體內狀態儲存，使狀態可在 task 重啟後保留並於容器間共用</w:t>
-      </w:r>
-    </w:p>
-    <w:p>
-      <w:pPr>
-        <w:spacing w:before="40" w:after="0"/>
-        <w:ind w:left="193" w:hanging="193"/>
-      </w:pPr>
-      <w:r>
-        <w:rPr>
-          <w:rFonts w:ascii="Noto Sans CJK TC" w:hAnsi="Noto Sans CJK TC" w:eastAsia="Noto Sans CJK TC"/>
-          <w:b w:val="0"/>
-          <w:i w:val="0"/>
-          <w:color w:val="111111"/>
-          <w:sz w:val="16"/>
-        </w:rPr>
-        <w:t xml:space="preserve">▪ </w:t>
-      </w:r>
-      <w:r>
-        <w:rPr>
-          <w:rFonts w:ascii="Noto Sans CJK TC" w:hAnsi="Noto Sans CJK TC" w:eastAsia="Noto Sans CJK TC"/>
-          <w:b w:val="0"/>
-          <w:i w:val="0"/>
-          <w:color w:val="111111"/>
-          <w:sz w:val="19"/>
-        </w:rPr>
-        <w:t>使用 UpdateItem 搭配 ConditionExpression（claimDraft）與 PutItem 搭配 attribute_not_exists 實作原子操作，避免跨容器重複送出</w:t>
-      </w:r>
-    </w:p>
-    <w:p>
-      <w:pPr>
-        <w:spacing w:before="40" w:after="0"/>
-        <w:ind w:left="193" w:hanging="193"/>
-      </w:pPr>
-      <w:r>
-        <w:rPr>
-          <w:rFonts w:ascii="Noto Sans CJK TC" w:hAnsi="Noto Sans CJK TC" w:eastAsia="Noto Sans CJK TC"/>
-          <w:b w:val="0"/>
-          <w:i w:val="0"/>
-          <w:color w:val="111111"/>
-          <w:sz w:val="16"/>
-        </w:rPr>
-        <w:t xml:space="preserve">▪ </w:t>
-      </w:r>
-      <w:r>
-        <w:rPr>
-          <w:rFonts w:ascii="Noto Sans CJK TC" w:hAnsi="Noto Sans CJK TC" w:eastAsia="Noto Sans CJK TC"/>
-          <w:b w:val="0"/>
-          <w:i w:val="0"/>
-          <w:color w:val="111111"/>
-          <w:sz w:val="19"/>
-        </w:rPr>
-        <w:t>設定 SQS 主佇列與 DLQ，VisibilityTimeout=180、maxReceiveCount=3，以保存、重試並隔離 poison message</w:t>
-      </w:r>
-    </w:p>
-    <w:p>
-      <w:pPr>
-        <w:spacing w:before="40" w:after="0"/>
-        <w:ind w:left="193" w:hanging="193"/>
-      </w:pPr>
-      <w:r>
-        <w:rPr>
-          <w:rFonts w:ascii="Noto Sans CJK TC" w:hAnsi="Noto Sans CJK TC" w:eastAsia="Noto Sans CJK TC"/>
-          <w:b w:val="0"/>
-          <w:i w:val="0"/>
-          <w:color w:val="111111"/>
-          <w:sz w:val="16"/>
-        </w:rPr>
-        <w:t xml:space="preserve">▪ </w:t>
-      </w:r>
-      <w:r>
-        <w:rPr>
-          <w:rFonts w:ascii="Noto Sans CJK TC" w:hAnsi="Noto Sans CJK TC" w:eastAsia="Noto Sans CJK TC"/>
-          <w:b w:val="0"/>
-          <w:i w:val="0"/>
-          <w:color w:val="111111"/>
-          <w:sz w:val="19"/>
-        </w:rPr>
-        <w:t>以 ffmpeg（16k 單聲道 16-bit LPCM、3200B/100ms 分塊）建立語音轉文字 pipeline，串接 Amazon Transcribe streaming 並啟用 zh-TW+en-US 多語言辨識</w:t>
-      </w:r>
-    </w:p>
-    <w:p>
-      <w:pPr>
-        <w:spacing w:before="40" w:after="0"/>
-        <w:ind w:left="193" w:hanging="193"/>
-      </w:pPr>
-      <w:r>
-        <w:rPr>
-          <w:rFonts w:ascii="Noto Sans CJK TC" w:hAnsi="Noto Sans CJK TC" w:eastAsia="Noto Sans CJK TC"/>
-          <w:b w:val="0"/>
-          <w:i w:val="0"/>
-          <w:color w:val="111111"/>
-          <w:sz w:val="16"/>
-        </w:rPr>
-        <w:t xml:space="preserve">▪ </w:t>
-      </w:r>
-      <w:r>
-        <w:rPr>
-          <w:rFonts w:ascii="Noto Sans CJK TC" w:hAnsi="Noto Sans CJK TC" w:eastAsia="Noto Sans CJK TC"/>
-          <w:b w:val="0"/>
-          <w:i w:val="0"/>
-          <w:color w:val="111111"/>
-          <w:sz w:val="19"/>
-        </w:rPr>
-        <w:t>建立自訂 Transcribe vocabulary（voice-notion-zhtw / voice-notion-enus），由 lib/vocabulary.ts 與 MEMBERS_JSON 同步，提升成員姓名與專案術語的辨識率</w:t>
-      </w:r>
-    </w:p>
-    <w:p>
-      <w:pPr>
-        <w:spacing w:before="40" w:after="0"/>
-        <w:ind w:left="193" w:hanging="193"/>
-      </w:pPr>
-      <w:r>
-        <w:rPr>
-          <w:rFonts w:ascii="Noto Sans CJK TC" w:hAnsi="Noto Sans CJK TC" w:eastAsia="Noto Sans CJK TC"/>
-          <w:b w:val="0"/>
-          <w:i w:val="0"/>
-          <w:color w:val="111111"/>
-          <w:sz w:val="16"/>
-        </w:rPr>
-        <w:t xml:space="preserve">▪ </w:t>
-      </w:r>
-      <w:r>
-        <w:rPr>
-          <w:rFonts w:ascii="Noto Sans CJK TC" w:hAnsi="Noto Sans CJK TC" w:eastAsia="Noto Sans CJK TC"/>
-          <w:b w:val="0"/>
-          <w:i w:val="0"/>
-          <w:color w:val="111111"/>
-          <w:sz w:val="19"/>
-        </w:rPr>
-        <w:t>透過 us-east-1 的 AnthropicBedrockMantle client 整合 Bedrock Claude Opus 4.8，使用 ECS task role SigV4 驗證，無需 API key</w:t>
-      </w:r>
-    </w:p>
-    <w:p>
-      <w:pPr>
-        <w:spacing w:before="40" w:after="0"/>
-        <w:ind w:left="193" w:hanging="193"/>
-      </w:pPr>
-      <w:r>
-        <w:rPr>
-          <w:rFonts w:ascii="Noto Sans CJK TC" w:hAnsi="Noto Sans CJK TC" w:eastAsia="Noto Sans CJK TC"/>
-          <w:b w:val="0"/>
-          <w:i w:val="0"/>
-          <w:color w:val="111111"/>
-          <w:sz w:val="16"/>
-        </w:rPr>
-        <w:t xml:space="preserve">▪ </w:t>
-      </w:r>
-      <w:r>
-        <w:rPr>
-          <w:rFonts w:ascii="Noto Sans CJK TC" w:hAnsi="Noto Sans CJK TC" w:eastAsia="Noto Sans CJK TC"/>
-          <w:b w:val="0"/>
-          <w:i w:val="0"/>
-          <w:color w:val="111111"/>
-          <w:sz w:val="19"/>
-        </w:rPr>
-        <w:t>因 Bedrock Nova 2 Sonic 為 speech-to-speech 模型，三次嘗試皆回傳 transcriptLength:0，將語音辨識改用 Amazon Transcribe</w:t>
-      </w:r>
-    </w:p>
-    <w:p>
-      <w:pPr>
-        <w:spacing w:before="40" w:after="0"/>
-        <w:ind w:left="193" w:hanging="193"/>
-      </w:pPr>
-      <w:r>
-        <w:rPr>
-          <w:rFonts w:ascii="Noto Sans CJK TC" w:hAnsi="Noto Sans CJK TC" w:eastAsia="Noto Sans CJK TC"/>
-          <w:b w:val="0"/>
-          <w:i w:val="0"/>
-          <w:color w:val="111111"/>
-          <w:sz w:val="16"/>
-        </w:rPr>
-        <w:t xml:space="preserve">▪ </w:t>
-      </w:r>
-      <w:r>
-        <w:rPr>
-          <w:rFonts w:ascii="Noto Sans CJK TC" w:hAnsi="Noto Sans CJK TC" w:eastAsia="Noto Sans CJK TC"/>
-          <w:b w:val="0"/>
-          <w:i w:val="0"/>
-          <w:color w:val="111111"/>
-          <w:sz w:val="19"/>
-        </w:rPr>
-        <w:t>將 cron route 改為送入佇列並立即回傳 200，並設定 EventBridge target MaximumRetryAttempts=0，解決 standup 重試風暴並消除重複摘要</w:t>
-      </w:r>
-    </w:p>
-    <w:p>
-      <w:pPr>
-        <w:spacing w:before="40" w:after="0"/>
-        <w:ind w:left="193" w:hanging="193"/>
-      </w:pPr>
-      <w:r>
-        <w:rPr>
-          <w:rFonts w:ascii="Noto Sans CJK TC" w:hAnsi="Noto Sans CJK TC" w:eastAsia="Noto Sans CJK TC"/>
-          <w:b w:val="0"/>
-          <w:i w:val="0"/>
-          <w:color w:val="111111"/>
-          <w:sz w:val="16"/>
-        </w:rPr>
-        <w:t xml:space="preserve">▪ </w:t>
-      </w:r>
-      <w:r>
-        <w:rPr>
-          <w:rFonts w:ascii="Noto Sans CJK TC" w:hAnsi="Noto Sans CJK TC" w:eastAsia="Noto Sans CJK TC"/>
-          <w:b w:val="0"/>
-          <w:i w:val="0"/>
-          <w:color w:val="111111"/>
-          <w:sz w:val="19"/>
-        </w:rPr>
-        <w:t>為符合法規要求（Security Hub ECS.2/ECS.5）調整部署方式，將 task 移至雙 AZ 私有子網路，設定 assignPublicIp=DISABLED、NAT 出口、唯讀 root filesystem 與 ephemeral volume</w:t>
-      </w:r>
-    </w:p>
-    <w:p>
-      <w:pPr>
-        <w:spacing w:before="40" w:after="0"/>
-        <w:ind w:left="193" w:hanging="193"/>
-      </w:pPr>
-      <w:r>
-        <w:rPr>
-          <w:rFonts w:ascii="Noto Sans CJK TC" w:hAnsi="Noto Sans CJK TC" w:eastAsia="Noto Sans CJK TC"/>
-          <w:b w:val="0"/>
-          <w:i w:val="0"/>
-          <w:color w:val="111111"/>
-          <w:sz w:val="16"/>
-        </w:rPr>
-        <w:t xml:space="preserve">▪ </w:t>
-      </w:r>
-      <w:r>
-        <w:rPr>
-          <w:rFonts w:ascii="Noto Sans CJK TC" w:hAnsi="Noto Sans CJK TC" w:eastAsia="Noto Sans CJK TC"/>
-          <w:b w:val="0"/>
-          <w:i w:val="0"/>
-          <w:color w:val="111111"/>
-          <w:sz w:val="19"/>
-        </w:rPr>
-        <w:t>在 443 listener 上新增 Target Group 與 host-based rule（priority 20），沿用現有的 aaron-dev ALB，而非另建 ALB/ACM/Route53</w:t>
-      </w:r>
-    </w:p>
-    <w:p>
-      <w:pPr>
-        <w:spacing w:before="40" w:after="0"/>
-        <w:ind w:left="193" w:hanging="193"/>
-      </w:pPr>
-      <w:r>
-        <w:rPr>
-          <w:rFonts w:ascii="Noto Sans CJK TC" w:hAnsi="Noto Sans CJK TC" w:eastAsia="Noto Sans CJK TC"/>
-          <w:b w:val="0"/>
-          <w:i w:val="0"/>
-          <w:color w:val="111111"/>
-          <w:sz w:val="16"/>
-        </w:rPr>
-        <w:t xml:space="preserve">▪ </w:t>
-      </w:r>
-      <w:r>
-        <w:rPr>
-          <w:rFonts w:ascii="Noto Sans CJK TC" w:hAnsi="Noto Sans CJK TC" w:eastAsia="Noto Sans CJK TC"/>
-          <w:b w:val="0"/>
-          <w:i w:val="0"/>
-          <w:color w:val="111111"/>
-          <w:sz w:val="19"/>
-        </w:rPr>
-        <w:t>將 Notion / Slack token、CRON_SECRET 與 MEMBERS_JSON 以 SSM Parameter Store SecureString 儲存，並於啟動時注入 task</w:t>
-      </w:r>
-    </w:p>
-    <w:p>
-      <w:pPr>
-        <w:spacing w:before="40" w:after="0"/>
-        <w:ind w:left="193" w:hanging="193"/>
-      </w:pPr>
-      <w:r>
-        <w:rPr>
-          <w:rFonts w:ascii="Noto Sans CJK TC" w:hAnsi="Noto Sans CJK TC" w:eastAsia="Noto Sans CJK TC"/>
-          <w:b w:val="0"/>
-          <w:i w:val="0"/>
-          <w:color w:val="111111"/>
-          <w:sz w:val="16"/>
-        </w:rPr>
-        <w:t xml:space="preserve">▪ </w:t>
-      </w:r>
-      <w:r>
-        <w:rPr>
-          <w:rFonts w:ascii="Noto Sans CJK TC" w:hAnsi="Noto Sans CJK TC" w:eastAsia="Noto Sans CJK TC"/>
-          <w:b w:val="0"/>
-          <w:i w:val="0"/>
-          <w:color w:val="111111"/>
-          <w:sz w:val="19"/>
-        </w:rPr>
-        <w:t>將 IAM 拆分為 execution role 與 task role，task role 權限限縮於 DynamoDB/SQS、bedrock:InvokeModel、bedrock-mantle:* 與 transcribe:StartStreamTranscription</w:t>
-      </w:r>
-    </w:p>
-    <w:p>
-      <w:pPr>
-        <w:spacing w:before="40" w:after="0"/>
-        <w:ind w:left="193" w:hanging="193"/>
-      </w:pPr>
-      <w:r>
-        <w:rPr>
-          <w:rFonts w:ascii="Noto Sans CJK TC" w:hAnsi="Noto Sans CJK TC" w:eastAsia="Noto Sans CJK TC"/>
-          <w:b w:val="0"/>
-          <w:i w:val="0"/>
-          <w:color w:val="111111"/>
-          <w:sz w:val="16"/>
-        </w:rPr>
-        <w:t xml:space="preserve">▪ </w:t>
-      </w:r>
-      <w:r>
-        <w:rPr>
-          <w:rFonts w:ascii="Noto Sans CJK TC" w:hAnsi="Noto Sans CJK TC" w:eastAsia="Noto Sans CJK TC"/>
-          <w:b w:val="0"/>
-          <w:i w:val="0"/>
-          <w:color w:val="111111"/>
-          <w:sz w:val="19"/>
-        </w:rPr>
-        <w:t>就常駐 worker、cold start/ffmpeg、HA、維運成本與私有子網路等條件，評估 Lambda + API Gateway、自管 EC2 與 App Runner，並與 ECS Fargate 比較</w:t>
-      </w:r>
-    </w:p>
-    <w:p>
-      <w:pPr>
-        <w:spacing w:before="40" w:after="0"/>
-        <w:ind w:left="193" w:hanging="193"/>
-      </w:pPr>
-      <w:r>
-        <w:rPr>
-          <w:rFonts w:ascii="Noto Sans CJK TC" w:hAnsi="Noto Sans CJK TC" w:eastAsia="Noto Sans CJK TC"/>
-          <w:b w:val="0"/>
-          <w:i w:val="0"/>
-          <w:color w:val="111111"/>
-          <w:sz w:val="16"/>
-        </w:rPr>
-        <w:t xml:space="preserve">▪ </w:t>
-      </w:r>
-      <w:r>
-        <w:rPr>
-          <w:rFonts w:ascii="Noto Sans CJK TC" w:hAnsi="Noto Sans CJK TC" w:eastAsia="Noto Sans CJK TC"/>
-          <w:b w:val="0"/>
-          <w:i w:val="0"/>
-          <w:color w:val="111111"/>
-          <w:sz w:val="19"/>
-        </w:rPr>
-        <w:t>沿用現有 ALB 與 NAT，記錄每月約 $57 的成本估算（不含 AI 使用量），並記錄可透過環境變數切換至 claude-sonnet-4-6 的調整方式</w:t>
-      </w:r>
-    </w:p>
-    <w:p>
-      <w:pPr>
-        <w:spacing w:before="40" w:after="0"/>
-        <w:ind w:left="193" w:hanging="193"/>
-      </w:pPr>
-      <w:r>
-        <w:rPr>
-          <w:rFonts w:ascii="Noto Sans CJK TC" w:hAnsi="Noto Sans CJK TC" w:eastAsia="Noto Sans CJK TC"/>
-          <w:b w:val="0"/>
-          <w:i w:val="0"/>
-          <w:color w:val="111111"/>
-          <w:sz w:val="16"/>
-        </w:rPr>
-        <w:t xml:space="preserve">▪ </w:t>
-      </w:r>
-      <w:r>
-        <w:rPr>
-          <w:rFonts w:ascii="Noto Sans CJK TC" w:hAnsi="Noto Sans CJK TC" w:eastAsia="Noto Sans CJK TC"/>
-          <w:b w:val="0"/>
-          <w:i w:val="0"/>
-          <w:color w:val="111111"/>
-          <w:sz w:val="19"/>
-        </w:rPr>
-        <w:t>撰寫維運 runbook，涵蓋發布、以 task-def revision 回滾、log 追蹤、DLQ redrive、密鑰輪替與擴充</w:t>
-      </w:r>
-    </w:p>
-    <w:p>
-      <w:pPr>
-        <w:spacing w:before="40" w:after="0"/>
-        <w:ind w:left="193" w:hanging="193"/>
-      </w:pPr>
-      <w:r>
-        <w:rPr>
-          <w:rFonts w:ascii="Noto Sans CJK TC" w:hAnsi="Noto Sans CJK TC" w:eastAsia="Noto Sans CJK TC"/>
-          <w:b w:val="0"/>
-          <w:i w:val="0"/>
-          <w:color w:val="111111"/>
-          <w:sz w:val="16"/>
-        </w:rPr>
-        <w:t xml:space="preserve">▪ </w:t>
-      </w:r>
-      <w:r>
-        <w:rPr>
-          <w:rFonts w:ascii="Noto Sans CJK TC" w:hAnsi="Noto Sans CJK TC" w:eastAsia="Noto Sans CJK TC"/>
-          <w:b w:val="0"/>
-          <w:i w:val="0"/>
-          <w:color w:val="111111"/>
-          <w:sz w:val="19"/>
-        </w:rPr>
-        <w:t>將 task definition 由 rev1 迭代至 rev9，每個 revision 對應一個特定問題，例如 Mantle 404、不支援的 output_config、Security Hub 檢查發現與重複的 standup 觸發</w:t>
+        <w:t>以持久性 worker、cold start/ffmpeg、HA、維運成本與 private subnet 等條件，評估 Lambda + API Gateway、自管 EC2 與 App Runner，並與 ECS Fargate 比較</w:t>
       </w:r>
     </w:p>
     <w:p>

</xml_diff>

<commit_message>
Publish output/zh/resume.docx (run 20260817T093722Z-manual)
</commit_message>
<xml_diff>
--- a/output/zh/resume.docx
+++ b/output/zh/resume.docx
@@ -1351,7 +1351,7 @@
                 <w:color w:val="111111"/>
                 <w:sz w:val="21"/>
               </w:rPr>
-              <w:t>voice-notion — Slack 語音轉 Notion 機器人雲原生架構</w:t>
+              <w:t>Voice-Notion — Slack 語音轉 Notion 機器人雲原生架構</w:t>
             </w:r>
           </w:p>
         </w:tc>
@@ -1401,7 +1401,7 @@
           <w:color w:val="111111"/>
           <w:sz w:val="19"/>
         </w:rPr>
-        <w:t>開發 Slack bot，將語音或文字 @mentions 轉換為可確認的 Notion 頁面與任務，並提供每日自動化 standup 摘要</w:t>
+        <w:t>開發 Slack bot，將 mp4 口頭工作報告轉換為可確認的 Notion 頁面與任務，並每日自動產生 standup 摘要</w:t>
       </w:r>
     </w:p>
     <w:p>
@@ -1427,7 +1427,7 @@
           <w:color w:val="111111"/>
           <w:sz w:val="19"/>
         </w:rPr>
-        <w:t>將單一實例的 Next.js 服務重新架構為雲原生 ECS Fargate 部署，搭配 DynamoDB、SQS 與 EventBridge，實現水平擴展與零資料遺失的滾動更新</w:t>
+        <w:t>將單一實例的 Next.js 服務重新架構為雲原生 ECS Fargate 部署，並整合 DynamoDB、SQS 與 EventBridge，實現水平擴展與零資料遺失的滾動更新</w:t>
       </w:r>
     </w:p>
     <w:p>
@@ -1453,7 +1453,7 @@
           <w:color w:val="111111"/>
           <w:sz w:val="19"/>
         </w:rPr>
-        <w:t>拆分 webhook 處理流程：web 端驗證簽章後送入 SQS 並於 3s 內回傳 200，worker 端則處理耗時 30–120s 的轉錄與 LLM 作業</w:t>
+        <w:t>拆分 webhook 處理流程：web 端驗證簽章、送入 SQS 並於 3s 內回傳 200，worker 端則處理耗時 30–120s 的轉錄與 LLM 作業</w:t>
       </w:r>
     </w:p>
     <w:p>
@@ -1479,7 +1479,7 @@
           <w:color w:val="111111"/>
           <w:sz w:val="19"/>
         </w:rPr>
-        <w:t>以持久性 worker、cold start/ffmpeg、HA、維運成本與 private subnet 等條件，評估 Lambda + API Gateway、自管 EC2 與 App Runner，並與 ECS Fargate 比較</w:t>
+        <w:t>以持續運行的 worker、cold start／ffmpeg、HA、維運成本與 private subnet 等條件，評估 Lambda + API Gateway、自建 EC2 與 App Runner，並與 ECS Fargate 比較</w:t>
       </w:r>
     </w:p>
     <w:p>

</xml_diff>

<commit_message>
Publish output/zh/resume.docx (run 20260817T094341Z-manual)
</commit_message>
<xml_diff>
--- a/output/zh/resume.docx
+++ b/output/zh/resume.docx
@@ -1401,7 +1401,7 @@
           <w:color w:val="111111"/>
           <w:sz w:val="19"/>
         </w:rPr>
-        <w:t>開發 Slack bot，將 mp4 口頭工作報告轉換為可確認的 Notion 頁面與任務，並每日自動產生 standup 摘要</w:t>
+        <w:t>開發 Slack bot，將 mp4 工作口頭報告轉換為可確認的 Notion 頁面與任務，並每日自動產生 standup 摘要</w:t>
       </w:r>
     </w:p>
     <w:p>
@@ -1427,7 +1427,7 @@
           <w:color w:val="111111"/>
           <w:sz w:val="19"/>
         </w:rPr>
-        <w:t>將單一實例的 Next.js 服務重新架構為雲原生 ECS Fargate 部署，並整合 DynamoDB、SQS 與 EventBridge，實現水平擴展與零資料遺失的滾動更新</w:t>
+        <w:t>將單一實例的 Next.js 服務重新架構為 cloud-native 的 ECS Fargate 部署，搭配 DynamoDB、SQS 與 EventBridge，實現水平擴展與零資料遺失的滾動更新</w:t>
       </w:r>
     </w:p>
     <w:p>
@@ -1453,7 +1453,7 @@
           <w:color w:val="111111"/>
           <w:sz w:val="19"/>
         </w:rPr>
-        <w:t>拆分 webhook 處理流程：web 端驗證簽章、送入 SQS 並於 3s 內回傳 200，worker 端則處理耗時 30–120s 的轉錄與 LLM 作業</w:t>
+        <w:t>拆分 webhook 處理流程，由 web 端驗證簽章、送入 SQS 並在 3 秒內回傳 200，transcription 與 LLM 等 30–120 秒的作業則交由 worker 處理</w:t>
       </w:r>
     </w:p>
     <w:p>
@@ -1479,7 +1479,7 @@
           <w:color w:val="111111"/>
           <w:sz w:val="19"/>
         </w:rPr>
-        <w:t>以持續運行的 worker、cold start／ffmpeg、HA、維運成本與 private subnet 等條件，評估 Lambda + API Gateway、自建 EC2 與 App Runner，並與 ECS Fargate 比較</w:t>
+        <w:t>以持續運行的 worker、cold start／ffmpeg、HA、維運成本與 private subnet 等條件，評估 Lambda + API Gateway、自管 EC2 與 App Runner，並與 ECS Fargate 比較</w:t>
       </w:r>
     </w:p>
     <w:p>

</xml_diff>

<commit_message>
Publish output/zh/resume.docx (run 20260828T062613Z-manual)
</commit_message>
<xml_diff>
--- a/output/zh/resume.docx
+++ b/output/zh/resume.docx
@@ -1033,7 +1033,7 @@
                 <w:color w:val="111111"/>
                 <w:sz w:val="21"/>
               </w:rPr>
-              <w:t>LLM 推論研究 — Self-Discover-NLI</w:t>
+              <w:t>AI News Agent — 三情境路由聊天機器人</w:t>
             </w:r>
           </w:p>
         </w:tc>
@@ -1054,7 +1054,7 @@
                 <w:color w:val="444444"/>
                 <w:sz w:val="19"/>
               </w:rPr>
-              <w:t>ROCLING Conference 2025</w:t>
+              <w:t>國泰金控 DDT AI</w:t>
             </w:r>
           </w:p>
         </w:tc>
@@ -1083,7 +1083,7 @@
           <w:color w:val="111111"/>
           <w:sz w:val="19"/>
         </w:rPr>
-        <w:t>開發並發表「Self-Discover-NLI」prompt engineering 框架，將 Self-Discover 三步驟流程（SELECT → ADAPT → APPLY）重新設計以應用於自然語言推論（NLI）任務。</w:t>
+        <w:t>以四層架構（介面 / 應用 / 資料 / 外部服務）打造內部 AI 研究報告查詢助理。</w:t>
       </w:r>
     </w:p>
     <w:p>
@@ -1109,7 +1109,7 @@
           <w:color w:val="111111"/>
           <w:sz w:val="19"/>
         </w:rPr>
-        <w:t>於 IMPPRES 資料集進行系統性實驗（每種觸發詞 95 個任務），評估 GPT-4o 對分裂句、條件句、情態詞等語言觸發詞的處理能力。</w:t>
+        <w:t>設計三情境分類系統（LLM 意圖偵測 + Python 狀態機），對明確、模糊與超出範圍的提問進行智慧路由。</w:t>
       </w:r>
     </w:p>
     <w:p>
@@ -1135,7 +1135,33 @@
           <w:color w:val="111111"/>
           <w:sz w:val="19"/>
         </w:rPr>
-        <w:t>整體準確率提升約 10%；並透過深入誤差分析指出模型的系統性弱點。</w:t>
+        <w:t>以 Lambda 非同步自呼叫突破 LINE Webhook 一秒逾時限制，支援 5–15 秒的 LLM 推論 + RAG 檢索流程。</w:t>
+      </w:r>
+    </w:p>
+    <w:p>
+      <w:pPr>
+        <w:spacing w:before="40" w:after="0"/>
+        <w:ind w:left="193" w:hanging="193"/>
+      </w:pPr>
+      <w:r>
+        <w:rPr>
+          <w:rFonts w:ascii="Noto Sans CJK TC" w:hAnsi="Noto Sans CJK TC" w:eastAsia="Noto Sans CJK TC"/>
+          <w:b w:val="0"/>
+          <w:i w:val="0"/>
+          <w:color w:val="111111"/>
+          <w:sz w:val="16"/>
+        </w:rPr>
+        <w:t xml:space="preserve">▪ </w:t>
+      </w:r>
+      <w:r>
+        <w:rPr>
+          <w:rFonts w:ascii="Noto Sans CJK TC" w:hAnsi="Noto Sans CJK TC" w:eastAsia="Noto Sans CJK TC"/>
+          <w:b w:val="0"/>
+          <w:i w:val="0"/>
+          <w:color w:val="111111"/>
+          <w:sz w:val="19"/>
+        </w:rPr>
+        <w:t>建置完整 ETL 流程（Google Sheets → Bedrock Embedding → OpenSearch），並依主題、來源、日期與訂閱層級做多維度篩選。</w:t>
       </w:r>
     </w:p>
     <w:p>
@@ -1401,7 +1427,7 @@
           <w:color w:val="111111"/>
           <w:sz w:val="19"/>
         </w:rPr>
-        <w:t>開發 Slack bot，將 mp4 工作口頭報告轉換為可確認的 Notion 頁面與任務，並每日自動產生 standup 摘要</w:t>
+        <w:t>開發 Slack bot，將 mp4 工作口頭報告轉換為可確認的 Notion 頁面與任務，並提供每日自動化 standup 摘要</w:t>
       </w:r>
     </w:p>
     <w:p>
@@ -1427,7 +1453,7 @@
           <w:color w:val="111111"/>
           <w:sz w:val="19"/>
         </w:rPr>
-        <w:t>將單一實例的 Next.js 服務重新架構為 cloud-native 的 ECS Fargate 部署，搭配 DynamoDB、SQS 與 EventBridge，實現水平擴展與零資料遺失的滾動更新</w:t>
+        <w:t>將單一實例的 Next.js 服務重新架構為雲原生 ECS Fargate 部署，搭配 DynamoDB、SQS 與 EventBridge，實現水平擴展與零資料遺失的滾動更新</w:t>
       </w:r>
     </w:p>
     <w:p>
@@ -1453,7 +1479,7 @@
           <w:color w:val="111111"/>
           <w:sz w:val="19"/>
         </w:rPr>
-        <w:t>拆分 webhook 處理流程，由 web 端驗證簽章、送入 SQS 並在 3 秒內回傳 200，transcription 與 LLM 等 30–120 秒的作業則交由 worker 處理</w:t>
+        <w:t>拆分 webhook 處理流程，由 web 端驗證簽章、寫入 SQS 並在 3 秒內回傳 200，worker 端則負責 30–120 秒的轉錄與 LLM 作業</w:t>
       </w:r>
     </w:p>
     <w:p>
@@ -1479,7 +1505,166 @@
           <w:color w:val="111111"/>
           <w:sz w:val="19"/>
         </w:rPr>
-        <w:t>以持續運行的 worker、cold start／ffmpeg、HA、維運成本與 private subnet 等條件，評估 Lambda + API Gateway、自管 EC2 與 App Runner，並與 ECS Fargate 比較</w:t>
+        <w:t>以持續運行 worker、cold start/ffmpeg、HA、營運成本與 private subnet 等條件，評估 Lambda + API Gateway、自管 EC2 與 App Runner，並與 ECS Fargate 比較</w:t>
+      </w:r>
+    </w:p>
+    <w:p>
+      <w:pPr>
+        <w:spacing w:before="240" w:after="60"/>
+        <w:keepNext/>
+        <w:pBdr>
+          <w:bottom w:val="single" w:sz="4" w:space="2" w:color="111111"/>
+        </w:pBdr>
+      </w:pPr>
+      <w:r>
+        <w:rPr>
+          <w:rFonts w:ascii="Noto Serif CJK TC" w:hAnsi="Noto Serif CJK TC" w:eastAsia="Noto Serif CJK TC"/>
+          <w:b/>
+          <w:color w:val="111111"/>
+          <w:sz w:val="21"/>
+        </w:rPr>
+        <w:t>論文與演講</w:t>
+      </w:r>
+    </w:p>
+    <w:tbl>
+      <w:tblPr>
+        <w:tblW w:type="auto" w:w="0"/>
+        <w:jc w:val="left"/>
+        <w:tblLayout w:type="autofit"/>
+        <w:tblLook w:firstColumn="1" w:firstRow="1" w:lastColumn="0" w:lastRow="0" w:noHBand="0" w:noVBand="1" w:val="04A0"/>
+        <w:tblBorders>
+          <w:top w:val="none" w:sz="0"/>
+          <w:left w:val="none" w:sz="0"/>
+          <w:bottom w:val="none" w:sz="0"/>
+          <w:right w:val="none" w:sz="0"/>
+          <w:insideH w:val="none" w:sz="0"/>
+          <w:insideV w:val="none" w:sz="0"/>
+        </w:tblBorders>
+      </w:tblPr>
+      <w:tblGrid>
+        <w:gridCol w:w="5159"/>
+        <w:gridCol w:w="5159"/>
+      </w:tblGrid>
+      <w:tr>
+        <w:tc>
+          <w:tcPr>
+            <w:tcW w:type="dxa" w:w="5159"/>
+          </w:tcPr>
+          <w:p>
+            <w:pPr>
+              <w:spacing w:before="0" w:after="0"/>
+            </w:pPr>
+            <w:r>
+              <w:rPr>
+                <w:rFonts w:ascii="Noto Sans CJK TC" w:hAnsi="Noto Sans CJK TC" w:eastAsia="Noto Sans CJK TC"/>
+                <w:b/>
+                <w:i w:val="0"/>
+                <w:color w:val="111111"/>
+                <w:sz w:val="21"/>
+              </w:rPr>
+              <w:t>LLM 推論研究 — Self-Discover-NLI</w:t>
+            </w:r>
+          </w:p>
+        </w:tc>
+        <w:tc>
+          <w:tcPr>
+            <w:tcW w:type="dxa" w:w="5159"/>
+          </w:tcPr>
+          <w:p>
+            <w:pPr>
+              <w:spacing w:before="0" w:after="0"/>
+              <w:jc w:val="right"/>
+            </w:pPr>
+            <w:r>
+              <w:rPr>
+                <w:rFonts w:ascii="Noto Sans CJK TC" w:hAnsi="Noto Sans CJK TC" w:eastAsia="Noto Sans CJK TC"/>
+                <w:b w:val="0"/>
+                <w:i w:val="0"/>
+                <w:color w:val="444444"/>
+                <w:sz w:val="19"/>
+              </w:rPr>
+              <w:t>2025 年 10 月</w:t>
+            </w:r>
+          </w:p>
+        </w:tc>
+      </w:tr>
+    </w:tbl>
+    <w:p>
+      <w:pPr>
+        <w:spacing w:before="20" w:after="0"/>
+        <w:ind w:left="193" w:hanging="193"/>
+      </w:pPr>
+      <w:r>
+        <w:rPr>
+          <w:rFonts w:ascii="Noto Sans CJK TC" w:hAnsi="Noto Sans CJK TC" w:eastAsia="Noto Sans CJK TC"/>
+          <w:b w:val="0"/>
+          <w:i w:val="0"/>
+          <w:color w:val="111111"/>
+          <w:sz w:val="16"/>
+        </w:rPr>
+        <w:t xml:space="preserve">▪ </w:t>
+      </w:r>
+      <w:r>
+        <w:rPr>
+          <w:rFonts w:ascii="Noto Sans CJK TC" w:hAnsi="Noto Sans CJK TC" w:eastAsia="Noto Sans CJK TC"/>
+          <w:b w:val="0"/>
+          <w:i w:val="0"/>
+          <w:color w:val="111111"/>
+          <w:sz w:val="19"/>
+        </w:rPr>
+        <w:t>開發並發表「Self-Discover-NLI」prompt engineering 框架，將 Self-Discover 三步驟流程（SELECT → ADAPT → APPLY）重新設計以應用於自然語言推論（NLI）任務。</w:t>
+      </w:r>
+    </w:p>
+    <w:p>
+      <w:pPr>
+        <w:spacing w:before="40" w:after="0"/>
+        <w:ind w:left="193" w:hanging="193"/>
+      </w:pPr>
+      <w:r>
+        <w:rPr>
+          <w:rFonts w:ascii="Noto Sans CJK TC" w:hAnsi="Noto Sans CJK TC" w:eastAsia="Noto Sans CJK TC"/>
+          <w:b w:val="0"/>
+          <w:i w:val="0"/>
+          <w:color w:val="111111"/>
+          <w:sz w:val="16"/>
+        </w:rPr>
+        <w:t xml:space="preserve">▪ </w:t>
+      </w:r>
+      <w:r>
+        <w:rPr>
+          <w:rFonts w:ascii="Noto Sans CJK TC" w:hAnsi="Noto Sans CJK TC" w:eastAsia="Noto Sans CJK TC"/>
+          <w:b w:val="0"/>
+          <w:i w:val="0"/>
+          <w:color w:val="111111"/>
+          <w:sz w:val="19"/>
+        </w:rPr>
+        <w:t>於 IMPPRES 資料集進行系統性實驗（每種觸發詞 95 個任務），評估 GPT-4o 對分裂句、條件句、情態詞等語言觸發詞的處理能力。</w:t>
+      </w:r>
+    </w:p>
+    <w:p>
+      <w:pPr>
+        <w:spacing w:before="40" w:after="0"/>
+        <w:ind w:left="193" w:hanging="193"/>
+      </w:pPr>
+      <w:r>
+        <w:rPr>
+          <w:rFonts w:ascii="Noto Sans CJK TC" w:hAnsi="Noto Sans CJK TC" w:eastAsia="Noto Sans CJK TC"/>
+          <w:b w:val="0"/>
+          <w:i w:val="0"/>
+          <w:color w:val="111111"/>
+          <w:sz w:val="16"/>
+        </w:rPr>
+        <w:t xml:space="preserve">▪ </w:t>
+      </w:r>
+      <w:r>
+        <w:rPr>
+          <w:rFonts w:ascii="Noto Sans CJK TC" w:hAnsi="Noto Sans CJK TC" w:eastAsia="Noto Sans CJK TC"/>
+          <w:b w:val="0"/>
+          <w:i w:val="0"/>
+          <w:color w:val="111111"/>
+          <w:sz w:val="19"/>
+        </w:rPr>
+        <w:t>整體準確率提升約 10%；並透過深入誤差分析指出模型的系統性弱點。</w:t>
       </w:r>
     </w:p>
     <w:p>
@@ -1572,7 +1757,7 @@
           <w:color w:val="111111"/>
           <w:sz w:val="19"/>
         </w:rPr>
-        <w:t>AWS（Lambda、Bedrock、OpenSearch）、Amazon Bedrock（Claude Opus 4.8 via AnthropicBedrockMantle client）、Amazon DynamoDB（single-table design、on-demand、TTL）、Amazon ECR（image storage tagged by git SHA / timestamp）、Amazon EventBridge（classic Rule、cron + API destination with Bearer auth）、Amazon SQS（main queue + DLQ、long-poll consumer）</w:t>
+        <w:t>AWS（Lambda、Bedrock、OpenSearch、DynamoDB、Amazon ECR、EventBridge、Amazon SQS）</w:t>
       </w:r>
     </w:p>
     <w:p>
@@ -1597,7 +1782,7 @@
           <w:color w:val="111111"/>
           <w:sz w:val="19"/>
         </w:rPr>
-        <w:t>LangGraph</w:t>
+        <w:t>LangGraph、LangChain</w:t>
       </w:r>
     </w:p>
     <w:p>
@@ -1647,7 +1832,7 @@
           <w:color w:val="111111"/>
           <w:sz w:val="19"/>
         </w:rPr>
-        <w:t>多益（聽讀 985、口說 180、寫作 170）</w:t>
+        <w:t>多益（聽讀 985、口說 180、寫作 170）、AWS SAA（Solutions Architect Associate）</w:t>
       </w:r>
     </w:p>
     <w:sectPr>

</xml_diff>

<commit_message>
Publish output/zh/resume.docx (run 20260828T063932Z-manual)
</commit_message>
<xml_diff>
--- a/output/zh/resume.docx
+++ b/output/zh/resume.docx
@@ -1427,7 +1427,7 @@
           <w:color w:val="111111"/>
           <w:sz w:val="19"/>
         </w:rPr>
-        <w:t>開發 Slack bot，將 mp4 工作口頭報告轉換為可確認的 Notion 頁面與任務，並提供每日自動化 standup 摘要</w:t>
+        <w:t>開發 Slack bot，將 mp4 口頭工作報告轉為可確認的 Notion 頁面與任務，並提供每日自動化 standup 摘要</w:t>
       </w:r>
     </w:p>
     <w:p>
@@ -1479,7 +1479,7 @@
           <w:color w:val="111111"/>
           <w:sz w:val="19"/>
         </w:rPr>
-        <w:t>拆分 webhook 處理流程，由 web 端驗證簽章、寫入 SQS 並在 3 秒內回傳 200，worker 端則負責 30–120 秒的轉錄與 LLM 作業</w:t>
+        <w:t>拆分 webhook 處理流程，由 web 端驗證簽章、送入 SQS 並在 3 秒內回傳 200，worker 端則處理耗時 30–120 秒的轉錄與 LLM 作業</w:t>
       </w:r>
     </w:p>
     <w:p>
@@ -1505,7 +1505,7 @@
           <w:color w:val="111111"/>
           <w:sz w:val="19"/>
         </w:rPr>
-        <w:t>以持續運行 worker、cold start/ffmpeg、HA、營運成本與 private subnet 等條件，評估 Lambda + API Gateway、自管 EC2 與 App Runner，並與 ECS Fargate 比較</w:t>
+        <w:t>以持續運行的 worker、冷啟動/ffmpeg、HA、維運成本與 private subnet 等條件，評估 Lambda + API Gateway、自建 EC2 與 App Runner，並與 ECS Fargate 比較</w:t>
       </w:r>
     </w:p>
     <w:p>
@@ -1562,7 +1562,7 @@
                 <w:color w:val="111111"/>
                 <w:sz w:val="21"/>
               </w:rPr>
-              <w:t>LLM 推論研究 — Self-Discover-NLI</w:t>
+              <w:t>Examining LLM's Ability to Judge Presuppositions: A Comparative Study of Zero-Shot and Self-Discover-NLI Prompting</w:t>
             </w:r>
           </w:p>
         </w:tc>
@@ -1583,7 +1583,7 @@
                 <w:color w:val="444444"/>
                 <w:sz w:val="19"/>
               </w:rPr>
-              <w:t>2025 年 10 月</w:t>
+              <w:t>ROCLING 2025</w:t>
             </w:r>
           </w:p>
         </w:tc>

</xml_diff>

<commit_message>
Publish output/zh/resume.docx (run 20260828T070902Z-manual)
</commit_message>
<xml_diff>
--- a/output/zh/resume.docx
+++ b/output/zh/resume.docx
@@ -1033,6 +1033,152 @@
                 <w:color w:val="111111"/>
                 <w:sz w:val="21"/>
               </w:rPr>
+              <w:t>Voice-Notion — Slack 語音轉 Notion 機器人雲原生架構</w:t>
+            </w:r>
+          </w:p>
+        </w:tc>
+        <w:tc>
+          <w:tcPr>
+            <w:tcW w:type="dxa" w:w="5159"/>
+          </w:tcPr>
+          <w:p>
+            <w:pPr>
+              <w:spacing w:before="0" w:after="0"/>
+              <w:jc w:val="right"/>
+            </w:pPr>
+            <w:r>
+              <w:rPr>
+                <w:rFonts w:ascii="Noto Sans CJK TC" w:hAnsi="Noto Sans CJK TC" w:eastAsia="Noto Sans CJK TC"/>
+                <w:b w:val="0"/>
+                <w:i w:val="0"/>
+                <w:color w:val="444444"/>
+                <w:sz w:val="19"/>
+              </w:rPr>
+              <w:t>國泰金控 DDT AI</w:t>
+            </w:r>
+          </w:p>
+        </w:tc>
+      </w:tr>
+    </w:tbl>
+    <w:p>
+      <w:pPr>
+        <w:spacing w:before="20" w:after="0"/>
+        <w:ind w:left="193" w:hanging="193"/>
+      </w:pPr>
+      <w:r>
+        <w:rPr>
+          <w:rFonts w:ascii="Noto Sans CJK TC" w:hAnsi="Noto Sans CJK TC" w:eastAsia="Noto Sans CJK TC"/>
+          <w:b w:val="0"/>
+          <w:i w:val="0"/>
+          <w:color w:val="111111"/>
+          <w:sz w:val="16"/>
+        </w:rPr>
+        <w:t xml:space="preserve">▪ </w:t>
+      </w:r>
+      <w:r>
+        <w:rPr>
+          <w:rFonts w:ascii="Noto Sans CJK TC" w:hAnsi="Noto Sans CJK TC" w:eastAsia="Noto Sans CJK TC"/>
+          <w:b w:val="0"/>
+          <w:i w:val="0"/>
+          <w:color w:val="111111"/>
+          <w:sz w:val="19"/>
+        </w:rPr>
+        <w:t>開發 Slack bot，將 mp4 口頭工作報告轉換為可確認的 Notion 頁面與任務，並每日自動產生 standup 摘要</w:t>
+      </w:r>
+    </w:p>
+    <w:p>
+      <w:pPr>
+        <w:spacing w:before="40" w:after="0"/>
+        <w:ind w:left="193" w:hanging="193"/>
+      </w:pPr>
+      <w:r>
+        <w:rPr>
+          <w:rFonts w:ascii="Noto Sans CJK TC" w:hAnsi="Noto Sans CJK TC" w:eastAsia="Noto Sans CJK TC"/>
+          <w:b w:val="0"/>
+          <w:i w:val="0"/>
+          <w:color w:val="111111"/>
+          <w:sz w:val="16"/>
+        </w:rPr>
+        <w:t xml:space="preserve">▪ </w:t>
+      </w:r>
+      <w:r>
+        <w:rPr>
+          <w:rFonts w:ascii="Noto Sans CJK TC" w:hAnsi="Noto Sans CJK TC" w:eastAsia="Noto Sans CJK TC"/>
+          <w:b w:val="0"/>
+          <w:i w:val="0"/>
+          <w:color w:val="111111"/>
+          <w:sz w:val="19"/>
+        </w:rPr>
+        <w:t>將單一實例的 Next.js 服務重新架構為雲原生 ECS Fargate 部署，搭配 DynamoDB、SQS 與 EventBridge，實現水平擴展與零資料遺失的滾動更新</w:t>
+      </w:r>
+    </w:p>
+    <w:p>
+      <w:pPr>
+        <w:spacing w:before="40" w:after="0"/>
+        <w:ind w:left="193" w:hanging="193"/>
+      </w:pPr>
+      <w:r>
+        <w:rPr>
+          <w:rFonts w:ascii="Noto Sans CJK TC" w:hAnsi="Noto Sans CJK TC" w:eastAsia="Noto Sans CJK TC"/>
+          <w:b w:val="0"/>
+          <w:i w:val="0"/>
+          <w:color w:val="111111"/>
+          <w:sz w:val="16"/>
+        </w:rPr>
+        <w:t xml:space="preserve">▪ </w:t>
+      </w:r>
+      <w:r>
+        <w:rPr>
+          <w:rFonts w:ascii="Noto Sans CJK TC" w:hAnsi="Noto Sans CJK TC" w:eastAsia="Noto Sans CJK TC"/>
+          <w:b w:val="0"/>
+          <w:i w:val="0"/>
+          <w:color w:val="111111"/>
+          <w:sz w:val="19"/>
+        </w:rPr>
+        <w:t>以維運成本與 private subnet 條件為評估標準，比較 Lambda + API Gateway、自管 EC2、App Runner 與 ECS Fargate</w:t>
+      </w:r>
+    </w:p>
+    <w:p>
+      <w:pPr>
+        <w:spacing w:after="140"/>
+      </w:pPr>
+    </w:p>
+    <w:tbl>
+      <w:tblPr>
+        <w:tblW w:type="auto" w:w="0"/>
+        <w:jc w:val="left"/>
+        <w:tblLayout w:type="autofit"/>
+        <w:tblLook w:firstColumn="1" w:firstRow="1" w:lastColumn="0" w:lastRow="0" w:noHBand="0" w:noVBand="1" w:val="04A0"/>
+        <w:tblBorders>
+          <w:top w:val="none" w:sz="0"/>
+          <w:left w:val="none" w:sz="0"/>
+          <w:bottom w:val="none" w:sz="0"/>
+          <w:right w:val="none" w:sz="0"/>
+          <w:insideH w:val="none" w:sz="0"/>
+          <w:insideV w:val="none" w:sz="0"/>
+        </w:tblBorders>
+      </w:tblPr>
+      <w:tblGrid>
+        <w:gridCol w:w="5159"/>
+        <w:gridCol w:w="5159"/>
+      </w:tblGrid>
+      <w:tr>
+        <w:tc>
+          <w:tcPr>
+            <w:tcW w:type="dxa" w:w="5159"/>
+          </w:tcPr>
+          <w:p>
+            <w:pPr>
+              <w:spacing w:before="0" w:after="0"/>
+            </w:pPr>
+            <w:r>
+              <w:rPr>
+                <w:rFonts w:ascii="Noto Sans CJK TC" w:hAnsi="Noto Sans CJK TC" w:eastAsia="Noto Sans CJK TC"/>
+                <w:b/>
+                <w:i w:val="0"/>
+                <w:color w:val="111111"/>
+                <w:sz w:val="21"/>
+              </w:rPr>
               <w:t>AI News Agent — 三情境路由聊天機器人</w:t>
             </w:r>
           </w:p>
@@ -1110,32 +1256,6 @@
           <w:sz w:val="19"/>
         </w:rPr>
         <w:t>設計三情境分類系統（LLM 意圖偵測 + Python 狀態機），對明確、模糊與超出範圍的提問進行智慧路由。</w:t>
-      </w:r>
-    </w:p>
-    <w:p>
-      <w:pPr>
-        <w:spacing w:before="40" w:after="0"/>
-        <w:ind w:left="193" w:hanging="193"/>
-      </w:pPr>
-      <w:r>
-        <w:rPr>
-          <w:rFonts w:ascii="Noto Sans CJK TC" w:hAnsi="Noto Sans CJK TC" w:eastAsia="Noto Sans CJK TC"/>
-          <w:b w:val="0"/>
-          <w:i w:val="0"/>
-          <w:color w:val="111111"/>
-          <w:sz w:val="16"/>
-        </w:rPr>
-        <w:t xml:space="preserve">▪ </w:t>
-      </w:r>
-      <w:r>
-        <w:rPr>
-          <w:rFonts w:ascii="Noto Sans CJK TC" w:hAnsi="Noto Sans CJK TC" w:eastAsia="Noto Sans CJK TC"/>
-          <w:b w:val="0"/>
-          <w:i w:val="0"/>
-          <w:color w:val="111111"/>
-          <w:sz w:val="19"/>
-        </w:rPr>
-        <w:t>以 Lambda 非同步自呼叫突破 LINE Webhook 一秒逾時限制，支援 5–15 秒的 LLM 推論 + RAG 檢索流程。</w:t>
       </w:r>
     </w:p>
     <w:p>
@@ -1255,7 +1375,7 @@
           <w:color w:val="111111"/>
           <w:sz w:val="19"/>
         </w:rPr>
-        <w:t>以 LangGraph + PostgresSaver 打造內部網頁應用，採分屏佈局（對話 ↔ 模式感知工作區）；BU Agent 作為業務單位的單一入口（兩種模式）草擬 v1.0 BRD，再將結構化交付物交棒給下游 BA Agent。</w:t>
+        <w:t>以 LangGraph + PostgresSaver 打造內部網頁應用，採分屏佈局（對話 ↔ 模式感知工作區）</w:t>
       </w:r>
     </w:p>
     <w:p>
@@ -1281,231 +1401,7 @@
           <w:color w:val="111111"/>
           <w:sz w:val="19"/>
         </w:rPr>
-        <w:t>Explore 模式：五階段題庫（發散 → 收斂 → 質疑）搭配即時五維度評分工作區；產出雙路交棒（JSON + 200–400 字段落）並自動轉入 Consult，將發想時間壓縮至 5–10 分鐘。</w:t>
-      </w:r>
-    </w:p>
-    <w:p>
-      <w:pPr>
-        <w:spacing w:before="40" w:after="0"/>
-        <w:ind w:left="193" w:hanging="193"/>
-      </w:pPr>
-      <w:r>
-        <w:rPr>
-          <w:rFonts w:ascii="Noto Sans CJK TC" w:hAnsi="Noto Sans CJK TC" w:eastAsia="Noto Sans CJK TC"/>
-          <w:b w:val="0"/>
-          <w:i w:val="0"/>
-          <w:color w:val="111111"/>
-          <w:sz w:val="16"/>
-        </w:rPr>
-        <w:t xml:space="preserve">▪ </w:t>
-      </w:r>
-      <w:r>
-        <w:rPr>
-          <w:rFonts w:ascii="Noto Sans CJK TC" w:hAnsi="Noto Sans CJK TC" w:eastAsia="Noto Sans CJK TC"/>
-          <w:b w:val="0"/>
-          <w:i w:val="0"/>
-          <w:color w:val="111111"/>
-          <w:sz w:val="19"/>
-        </w:rPr>
-        <w:t>Consult 模式：第一步依各 BU 的 YAML 模板自動草擬 BRD 大綱，將節次標記為 auto_filled / needs_round2 / placeholder；第二步只訪談 needs_round2 節次並提供即時預覽的行內編輯，將訪談時間控制在 20–30 分鐘。</w:t>
-      </w:r>
-    </w:p>
-    <w:p>
-      <w:pPr>
-        <w:spacing w:before="40" w:after="0"/>
-        <w:ind w:left="193" w:hanging="193"/>
-      </w:pPr>
-      <w:r>
-        <w:rPr>
-          <w:rFonts w:ascii="Noto Sans CJK TC" w:hAnsi="Noto Sans CJK TC" w:eastAsia="Noto Sans CJK TC"/>
-          <w:b w:val="0"/>
-          <w:i w:val="0"/>
-          <w:color w:val="111111"/>
-          <w:sz w:val="16"/>
-        </w:rPr>
-        <w:t xml:space="preserve">▪ </w:t>
-      </w:r>
-      <w:r>
-        <w:rPr>
-          <w:rFonts w:ascii="Noto Sans CJK TC" w:hAnsi="Noto Sans CJK TC" w:eastAsia="Noto Sans CJK TC"/>
-          <w:b w:val="0"/>
-          <w:i w:val="0"/>
-          <w:color w:val="111111"/>
-          <w:sz w:val="19"/>
-        </w:rPr>
-        <w:t>產出 v1.0 BRD、summary.json、完整 conversation_trace 與 flag_for_ba_review 清單，並於交棒時通知 BA Agent 審閱。</w:t>
-      </w:r>
-    </w:p>
-    <w:p>
-      <w:pPr>
-        <w:spacing w:after="140"/>
-      </w:pPr>
-    </w:p>
-    <w:tbl>
-      <w:tblPr>
-        <w:tblW w:type="auto" w:w="0"/>
-        <w:jc w:val="left"/>
-        <w:tblLayout w:type="autofit"/>
-        <w:tblLook w:firstColumn="1" w:firstRow="1" w:lastColumn="0" w:lastRow="0" w:noHBand="0" w:noVBand="1" w:val="04A0"/>
-        <w:tblBorders>
-          <w:top w:val="none" w:sz="0"/>
-          <w:left w:val="none" w:sz="0"/>
-          <w:bottom w:val="none" w:sz="0"/>
-          <w:right w:val="none" w:sz="0"/>
-          <w:insideH w:val="none" w:sz="0"/>
-          <w:insideV w:val="none" w:sz="0"/>
-        </w:tblBorders>
-      </w:tblPr>
-      <w:tblGrid>
-        <w:gridCol w:w="5159"/>
-        <w:gridCol w:w="5159"/>
-      </w:tblGrid>
-      <w:tr>
-        <w:tc>
-          <w:tcPr>
-            <w:tcW w:type="dxa" w:w="5159"/>
-          </w:tcPr>
-          <w:p>
-            <w:pPr>
-              <w:spacing w:before="0" w:after="0"/>
-            </w:pPr>
-            <w:r>
-              <w:rPr>
-                <w:rFonts w:ascii="Noto Sans CJK TC" w:hAnsi="Noto Sans CJK TC" w:eastAsia="Noto Sans CJK TC"/>
-                <w:b/>
-                <w:i w:val="0"/>
-                <w:color w:val="111111"/>
-                <w:sz w:val="21"/>
-              </w:rPr>
-              <w:t>Voice-Notion — Slack 語音轉 Notion 機器人雲原生架構</w:t>
-            </w:r>
-          </w:p>
-        </w:tc>
-        <w:tc>
-          <w:tcPr>
-            <w:tcW w:type="dxa" w:w="5159"/>
-          </w:tcPr>
-          <w:p>
-            <w:pPr>
-              <w:spacing w:before="0" w:after="0"/>
-              <w:jc w:val="right"/>
-            </w:pPr>
-            <w:r>
-              <w:rPr>
-                <w:rFonts w:ascii="Noto Sans CJK TC" w:hAnsi="Noto Sans CJK TC" w:eastAsia="Noto Sans CJK TC"/>
-                <w:b w:val="0"/>
-                <w:i w:val="0"/>
-                <w:color w:val="444444"/>
-                <w:sz w:val="19"/>
-              </w:rPr>
-              <w:t>國泰金控 DDT AI</w:t>
-            </w:r>
-          </w:p>
-        </w:tc>
-      </w:tr>
-    </w:tbl>
-    <w:p>
-      <w:pPr>
-        <w:spacing w:before="20" w:after="0"/>
-        <w:ind w:left="193" w:hanging="193"/>
-      </w:pPr>
-      <w:r>
-        <w:rPr>
-          <w:rFonts w:ascii="Noto Sans CJK TC" w:hAnsi="Noto Sans CJK TC" w:eastAsia="Noto Sans CJK TC"/>
-          <w:b w:val="0"/>
-          <w:i w:val="0"/>
-          <w:color w:val="111111"/>
-          <w:sz w:val="16"/>
-        </w:rPr>
-        <w:t xml:space="preserve">▪ </w:t>
-      </w:r>
-      <w:r>
-        <w:rPr>
-          <w:rFonts w:ascii="Noto Sans CJK TC" w:hAnsi="Noto Sans CJK TC" w:eastAsia="Noto Sans CJK TC"/>
-          <w:b w:val="0"/>
-          <w:i w:val="0"/>
-          <w:color w:val="111111"/>
-          <w:sz w:val="19"/>
-        </w:rPr>
-        <w:t>開發 Slack bot，將 mp4 口頭工作報告轉為可確認的 Notion 頁面與任務，並提供每日自動化 standup 摘要</w:t>
-      </w:r>
-    </w:p>
-    <w:p>
-      <w:pPr>
-        <w:spacing w:before="40" w:after="0"/>
-        <w:ind w:left="193" w:hanging="193"/>
-      </w:pPr>
-      <w:r>
-        <w:rPr>
-          <w:rFonts w:ascii="Noto Sans CJK TC" w:hAnsi="Noto Sans CJK TC" w:eastAsia="Noto Sans CJK TC"/>
-          <w:b w:val="0"/>
-          <w:i w:val="0"/>
-          <w:color w:val="111111"/>
-          <w:sz w:val="16"/>
-        </w:rPr>
-        <w:t xml:space="preserve">▪ </w:t>
-      </w:r>
-      <w:r>
-        <w:rPr>
-          <w:rFonts w:ascii="Noto Sans CJK TC" w:hAnsi="Noto Sans CJK TC" w:eastAsia="Noto Sans CJK TC"/>
-          <w:b w:val="0"/>
-          <w:i w:val="0"/>
-          <w:color w:val="111111"/>
-          <w:sz w:val="19"/>
-        </w:rPr>
-        <w:t>將單一實例的 Next.js 服務重新架構為雲原生 ECS Fargate 部署，搭配 DynamoDB、SQS 與 EventBridge，實現水平擴展與零資料遺失的滾動更新</w:t>
-      </w:r>
-    </w:p>
-    <w:p>
-      <w:pPr>
-        <w:spacing w:before="40" w:after="0"/>
-        <w:ind w:left="193" w:hanging="193"/>
-      </w:pPr>
-      <w:r>
-        <w:rPr>
-          <w:rFonts w:ascii="Noto Sans CJK TC" w:hAnsi="Noto Sans CJK TC" w:eastAsia="Noto Sans CJK TC"/>
-          <w:b w:val="0"/>
-          <w:i w:val="0"/>
-          <w:color w:val="111111"/>
-          <w:sz w:val="16"/>
-        </w:rPr>
-        <w:t xml:space="preserve">▪ </w:t>
-      </w:r>
-      <w:r>
-        <w:rPr>
-          <w:rFonts w:ascii="Noto Sans CJK TC" w:hAnsi="Noto Sans CJK TC" w:eastAsia="Noto Sans CJK TC"/>
-          <w:b w:val="0"/>
-          <w:i w:val="0"/>
-          <w:color w:val="111111"/>
-          <w:sz w:val="19"/>
-        </w:rPr>
-        <w:t>拆分 webhook 處理流程，由 web 端驗證簽章、送入 SQS 並在 3 秒內回傳 200，worker 端則處理耗時 30–120 秒的轉錄與 LLM 作業</w:t>
-      </w:r>
-    </w:p>
-    <w:p>
-      <w:pPr>
-        <w:spacing w:before="40" w:after="0"/>
-        <w:ind w:left="193" w:hanging="193"/>
-      </w:pPr>
-      <w:r>
-        <w:rPr>
-          <w:rFonts w:ascii="Noto Sans CJK TC" w:hAnsi="Noto Sans CJK TC" w:eastAsia="Noto Sans CJK TC"/>
-          <w:b w:val="0"/>
-          <w:i w:val="0"/>
-          <w:color w:val="111111"/>
-          <w:sz w:val="16"/>
-        </w:rPr>
-        <w:t xml:space="preserve">▪ </w:t>
-      </w:r>
-      <w:r>
-        <w:rPr>
-          <w:rFonts w:ascii="Noto Sans CJK TC" w:hAnsi="Noto Sans CJK TC" w:eastAsia="Noto Sans CJK TC"/>
-          <w:b w:val="0"/>
-          <w:i w:val="0"/>
-          <w:color w:val="111111"/>
-          <w:sz w:val="19"/>
-        </w:rPr>
-        <w:t>以持續運行的 worker、冷啟動/ffmpeg、HA、維運成本與 private subnet 等條件，評估 Lambda + API Gateway、自建 EC2 與 App Runner，並與 ECS Fargate 比較</w:t>
+        <w:t>BU Agent 作為業務單位的單一入口（兩種模式）草擬 v1.0 BRD，再將結構化交付物交棒給下游 BA Agent。</w:t>
       </w:r>
     </w:p>
     <w:p>

</xml_diff>

<commit_message>
Publish output/zh/resume.docx (run 20260828T071457Z-manual)
</commit_message>
<xml_diff>
--- a/output/zh/resume.docx
+++ b/output/zh/resume.docx
@@ -654,189 +654,6 @@
                 <w:color w:val="111111"/>
                 <w:sz w:val="21"/>
               </w:rPr>
-              <w:t>國立臺灣大學</w:t>
-            </w:r>
-          </w:p>
-        </w:tc>
-        <w:tc>
-          <w:tcPr>
-            <w:tcW w:type="dxa" w:w="5159"/>
-          </w:tcPr>
-          <w:p>
-            <w:pPr>
-              <w:spacing w:before="0" w:after="0"/>
-              <w:jc w:val="right"/>
-            </w:pPr>
-            <w:r>
-              <w:rPr>
-                <w:rFonts w:ascii="Noto Sans CJK TC" w:hAnsi="Noto Sans CJK TC" w:eastAsia="Noto Sans CJK TC"/>
-                <w:b w:val="0"/>
-                <w:i w:val="0"/>
-                <w:color w:val="444444"/>
-                <w:sz w:val="19"/>
-              </w:rPr>
-              <w:t>台灣台北</w:t>
-            </w:r>
-          </w:p>
-        </w:tc>
-      </w:tr>
-    </w:tbl>
-    <w:tbl>
-      <w:tblPr>
-        <w:tblW w:type="auto" w:w="0"/>
-        <w:jc w:val="left"/>
-        <w:tblLayout w:type="autofit"/>
-        <w:tblLook w:firstColumn="1" w:firstRow="1" w:lastColumn="0" w:lastRow="0" w:noHBand="0" w:noVBand="1" w:val="04A0"/>
-        <w:tblBorders>
-          <w:top w:val="none" w:sz="0"/>
-          <w:left w:val="none" w:sz="0"/>
-          <w:bottom w:val="none" w:sz="0"/>
-          <w:right w:val="none" w:sz="0"/>
-          <w:insideH w:val="none" w:sz="0"/>
-          <w:insideV w:val="none" w:sz="0"/>
-        </w:tblBorders>
-      </w:tblPr>
-      <w:tblGrid>
-        <w:gridCol w:w="5159"/>
-        <w:gridCol w:w="5159"/>
-      </w:tblGrid>
-      <w:tr>
-        <w:tc>
-          <w:tcPr>
-            <w:tcW w:type="dxa" w:w="5159"/>
-          </w:tcPr>
-          <w:p>
-            <w:pPr>
-              <w:spacing w:before="0" w:after="0"/>
-            </w:pPr>
-            <w:r>
-              <w:rPr>
-                <w:rFonts w:ascii="Noto Sans CJK TC" w:hAnsi="Noto Sans CJK TC" w:eastAsia="Noto Sans CJK TC"/>
-                <w:b w:val="0"/>
-                <w:i w:val="0"/>
-                <w:color w:val="444444"/>
-                <w:sz w:val="19"/>
-              </w:rPr>
-              <w:t>研究助理（石書豪教授）</w:t>
-            </w:r>
-          </w:p>
-        </w:tc>
-        <w:tc>
-          <w:tcPr>
-            <w:tcW w:type="dxa" w:w="5159"/>
-          </w:tcPr>
-          <w:p>
-            <w:pPr>
-              <w:spacing w:before="0" w:after="0"/>
-              <w:jc w:val="right"/>
-            </w:pPr>
-            <w:r>
-              <w:rPr>
-                <w:rFonts w:ascii="Noto Sans CJK TC" w:hAnsi="Noto Sans CJK TC" w:eastAsia="Noto Sans CJK TC"/>
-                <w:b w:val="0"/>
-                <w:i w:val="0"/>
-                <w:color w:val="444444"/>
-                <w:sz w:val="19"/>
-              </w:rPr>
-              <w:t>2024 年 6 月 ～ 2026 年 6 月</w:t>
-            </w:r>
-          </w:p>
-        </w:tc>
-      </w:tr>
-    </w:tbl>
-    <w:p>
-      <w:pPr>
-        <w:spacing w:before="20" w:after="0"/>
-        <w:ind w:left="193" w:hanging="193"/>
-      </w:pPr>
-      <w:r>
-        <w:rPr>
-          <w:rFonts w:ascii="Noto Sans CJK TC" w:hAnsi="Noto Sans CJK TC" w:eastAsia="Noto Sans CJK TC"/>
-          <w:b w:val="0"/>
-          <w:i w:val="0"/>
-          <w:color w:val="111111"/>
-          <w:sz w:val="16"/>
-        </w:rPr>
-        <w:t xml:space="preserve">▪ </w:t>
-      </w:r>
-      <w:r>
-        <w:rPr>
-          <w:rFonts w:ascii="Noto Sans CJK TC" w:hAnsi="Noto Sans CJK TC" w:eastAsia="Noto Sans CJK TC"/>
-          <w:b w:val="0"/>
-          <w:i w:val="0"/>
-          <w:color w:val="111111"/>
-          <w:sz w:val="19"/>
-        </w:rPr>
-        <w:t>設計感知實驗架構、準備實驗刺激並分析非 mora 音節 schwa 負重音自然度資料。</w:t>
-      </w:r>
-    </w:p>
-    <w:p>
-      <w:pPr>
-        <w:spacing w:before="40" w:after="0"/>
-        <w:ind w:left="193" w:hanging="193"/>
-      </w:pPr>
-      <w:r>
-        <w:rPr>
-          <w:rFonts w:ascii="Noto Sans CJK TC" w:hAnsi="Noto Sans CJK TC" w:eastAsia="Noto Sans CJK TC"/>
-          <w:b w:val="0"/>
-          <w:i w:val="0"/>
-          <w:color w:val="111111"/>
-          <w:sz w:val="16"/>
-        </w:rPr>
-        <w:t xml:space="preserve">▪ </w:t>
-      </w:r>
-      <w:r>
-        <w:rPr>
-          <w:rFonts w:ascii="Noto Sans CJK TC" w:hAnsi="Noto Sans CJK TC" w:eastAsia="Noto Sans CJK TC"/>
-          <w:b w:val="0"/>
-          <w:i w:val="0"/>
-          <w:color w:val="111111"/>
-          <w:sz w:val="19"/>
-        </w:rPr>
-        <w:t>回顧人工學習實驗相關音韻學文獻，並以 Praat 與 PsychoPy 製作實驗刺激。</w:t>
-      </w:r>
-    </w:p>
-    <w:p>
-      <w:pPr>
-        <w:spacing w:after="140"/>
-      </w:pPr>
-    </w:p>
-    <w:tbl>
-      <w:tblPr>
-        <w:tblW w:type="auto" w:w="0"/>
-        <w:jc w:val="left"/>
-        <w:tblLayout w:type="autofit"/>
-        <w:tblLook w:firstColumn="1" w:firstRow="1" w:lastColumn="0" w:lastRow="0" w:noHBand="0" w:noVBand="1" w:val="04A0"/>
-        <w:tblBorders>
-          <w:top w:val="none" w:sz="0"/>
-          <w:left w:val="none" w:sz="0"/>
-          <w:bottom w:val="none" w:sz="0"/>
-          <w:right w:val="none" w:sz="0"/>
-          <w:insideH w:val="none" w:sz="0"/>
-          <w:insideV w:val="none" w:sz="0"/>
-        </w:tblBorders>
-      </w:tblPr>
-      <w:tblGrid>
-        <w:gridCol w:w="5159"/>
-        <w:gridCol w:w="5159"/>
-      </w:tblGrid>
-      <w:tr>
-        <w:tc>
-          <w:tcPr>
-            <w:tcW w:type="dxa" w:w="5159"/>
-          </w:tcPr>
-          <w:p>
-            <w:pPr>
-              <w:spacing w:before="0" w:after="0"/>
-            </w:pPr>
-            <w:r>
-              <w:rPr>
-                <w:rFonts w:ascii="Noto Sans CJK TC" w:hAnsi="Noto Sans CJK TC" w:eastAsia="Noto Sans CJK TC"/>
-                <w:b/>
-                <w:i w:val="0"/>
-                <w:color w:val="111111"/>
-                <w:sz w:val="21"/>
-              </w:rPr>
               <w:t>台灣人工智慧學校（AIA）</w:t>
             </w:r>
           </w:p>
@@ -1083,7 +900,7 @@
           <w:color w:val="111111"/>
           <w:sz w:val="19"/>
         </w:rPr>
-        <w:t>開發 Slack bot，將 mp4 口頭工作報告轉換為可確認的 Notion 頁面與任務，並每日自動產生 standup 摘要</w:t>
+        <w:t>開發 Slack bot，將 mp4 口頭工作報告轉換為可確認的 Notion 頁面與任務，並提供每日自動化 standup 摘要</w:t>
       </w:r>
     </w:p>
     <w:p>
@@ -1135,7 +952,7 @@
           <w:color w:val="111111"/>
           <w:sz w:val="19"/>
         </w:rPr>
-        <w:t>以維運成本與 private subnet 條件為評估標準，比較 Lambda + API Gateway、自管 EC2、App Runner 與 ECS Fargate</w:t>
+        <w:t>以維運成本與 private subnet 條件評估 Lambda + API Gateway、自管 EC2 與 App Runner，並與 ECS Fargate 比較</w:t>
       </w:r>
     </w:p>
     <w:p>

</xml_diff>

<commit_message>
Publish output/zh/resume.docx (run 20260828T082558Z-manual)
</commit_message>
<xml_diff>
--- a/output/zh/resume.docx
+++ b/output/zh/resume.docx
@@ -362,32 +362,6 @@
           <w:color w:val="111111"/>
           <w:sz w:val="19"/>
         </w:rPr>
-        <w:t>參與臺大中英翻譯學程</w:t>
-      </w:r>
-    </w:p>
-    <w:p>
-      <w:pPr>
-        <w:spacing w:before="40" w:after="0"/>
-        <w:ind w:left="193" w:hanging="193"/>
-      </w:pPr>
-      <w:r>
-        <w:rPr>
-          <w:rFonts w:ascii="Noto Sans CJK TC" w:hAnsi="Noto Sans CJK TC" w:eastAsia="Noto Sans CJK TC"/>
-          <w:b w:val="0"/>
-          <w:i w:val="0"/>
-          <w:color w:val="111111"/>
-          <w:sz w:val="16"/>
-        </w:rPr>
-        <w:t xml:space="preserve">▪ </w:t>
-      </w:r>
-      <w:r>
-        <w:rPr>
-          <w:rFonts w:ascii="Noto Sans CJK TC" w:hAnsi="Noto Sans CJK TC" w:eastAsia="Noto Sans CJK TC"/>
-          <w:b w:val="0"/>
-          <w:i w:val="0"/>
-          <w:color w:val="111111"/>
-          <w:sz w:val="19"/>
-        </w:rPr>
         <w:t>修習課程：自然語言處理、計算語言學、音韻學、語意學</w:t>
       </w:r>
     </w:p>
@@ -558,59 +532,7 @@
           <w:color w:val="111111"/>
           <w:sz w:val="19"/>
         </w:rPr>
-        <w:t>優化 AI News agent 的編排邏輯、資料 ETL、LINE 整合與 AWS 部署架構。</w:t>
-      </w:r>
-    </w:p>
-    <w:p>
-      <w:pPr>
-        <w:spacing w:before="40" w:after="0"/>
-        <w:ind w:left="193" w:hanging="193"/>
-      </w:pPr>
-      <w:r>
-        <w:rPr>
-          <w:rFonts w:ascii="Noto Sans CJK TC" w:hAnsi="Noto Sans CJK TC" w:eastAsia="Noto Sans CJK TC"/>
-          <w:b w:val="0"/>
-          <w:i w:val="0"/>
-          <w:color w:val="111111"/>
-          <w:sz w:val="16"/>
-        </w:rPr>
-        <w:t xml:space="preserve">▪ </w:t>
-      </w:r>
-      <w:r>
-        <w:rPr>
-          <w:rFonts w:ascii="Noto Sans CJK TC" w:hAnsi="Noto Sans CJK TC" w:eastAsia="Noto Sans CJK TC"/>
-          <w:b w:val="0"/>
-          <w:i w:val="0"/>
-          <w:color w:val="111111"/>
-          <w:sz w:val="19"/>
-        </w:rPr>
-        <w:t>打造以錄音 ASR 為基礎、具 human-in-the-loop 審核的 BRD 自動修訂 agent。</w:t>
-      </w:r>
-    </w:p>
-    <w:p>
-      <w:pPr>
-        <w:spacing w:before="40" w:after="0"/>
-        <w:ind w:left="193" w:hanging="193"/>
-      </w:pPr>
-      <w:r>
-        <w:rPr>
-          <w:rFonts w:ascii="Noto Sans CJK TC" w:hAnsi="Noto Sans CJK TC" w:eastAsia="Noto Sans CJK TC"/>
-          <w:b w:val="0"/>
-          <w:i w:val="0"/>
-          <w:color w:val="111111"/>
-          <w:sz w:val="16"/>
-        </w:rPr>
-        <w:t xml:space="preserve">▪ </w:t>
-      </w:r>
-      <w:r>
-        <w:rPr>
-          <w:rFonts w:ascii="Noto Sans CJK TC" w:hAnsi="Noto Sans CJK TC" w:eastAsia="Noto Sans CJK TC"/>
-          <w:b w:val="0"/>
-          <w:i w:val="0"/>
-          <w:color w:val="111111"/>
-          <w:sz w:val="19"/>
-        </w:rPr>
-        <w:t>於 AWS 上以 streaming LLM 部署語音驅動的表單填寫服務，供企業內部使用。</w:t>
+        <w:t>開發針對內部業務流程優化的 LLM agent，並設計與部署其背後的雲端架構 。負責 AI 應用層與其運行的生產環境基礎架構。</w:t>
       </w:r>
     </w:p>
     <w:p>
@@ -767,33 +689,7 @@
           <w:color w:val="111111"/>
           <w:sz w:val="19"/>
         </w:rPr>
-        <w:t>以 n8n RPA 工作流架設 LINE LIFF 職涯諮詢聊天機器人，並以 Supabase 管理使用者資料。</w:t>
-      </w:r>
-    </w:p>
-    <w:p>
-      <w:pPr>
-        <w:spacing w:before="40" w:after="0"/>
-        <w:ind w:left="193" w:hanging="193"/>
-      </w:pPr>
-      <w:r>
-        <w:rPr>
-          <w:rFonts w:ascii="Noto Sans CJK TC" w:hAnsi="Noto Sans CJK TC" w:eastAsia="Noto Sans CJK TC"/>
-          <w:b w:val="0"/>
-          <w:i w:val="0"/>
-          <w:color w:val="111111"/>
-          <w:sz w:val="16"/>
-        </w:rPr>
-        <w:t xml:space="preserve">▪ </w:t>
-      </w:r>
-      <w:r>
-        <w:rPr>
-          <w:rFonts w:ascii="Noto Sans CJK TC" w:hAnsi="Noto Sans CJK TC" w:eastAsia="Noto Sans CJK TC"/>
-          <w:b w:val="0"/>
-          <w:i w:val="0"/>
-          <w:color w:val="111111"/>
-          <w:sz w:val="19"/>
-        </w:rPr>
-        <w:t>擅任企業雲端平台教育課程的技術支援。</w:t>
+        <w:t>開發與支援並行的角色：開發AI 原生應用，同時擔任企業課程現場的第一線技術支援。</w:t>
       </w:r>
     </w:p>
     <w:p>
@@ -900,7 +796,7 @@
           <w:color w:val="111111"/>
           <w:sz w:val="19"/>
         </w:rPr>
-        <w:t>開發 Slack bot，將 mp4 口頭工作報告轉換為可確認的 Notion 頁面與任務，並提供每日自動化 standup 摘要</w:t>
+        <w:t>開發 Slack bot，將 mp4 口頭工作報告轉換為可確認的 Notion 頁面與任務，並每日自動產出 standup 摘要</w:t>
       </w:r>
     </w:p>
     <w:p>
@@ -1460,31 +1356,6 @@
           <w:color w:val="111111"/>
           <w:sz w:val="19"/>
         </w:rPr>
-        <w:t xml:space="preserve">雲端與基礎架構: </w:t>
-      </w:r>
-      <w:r>
-        <w:rPr>
-          <w:rFonts w:ascii="Noto Sans CJK TC" w:hAnsi="Noto Sans CJK TC" w:eastAsia="Noto Sans CJK TC"/>
-          <w:b w:val="0"/>
-          <w:i w:val="0"/>
-          <w:color w:val="111111"/>
-          <w:sz w:val="19"/>
-        </w:rPr>
-        <w:t>AWS（Lambda、Bedrock、OpenSearch、DynamoDB、Amazon ECR、EventBridge、Amazon SQS）</w:t>
-      </w:r>
-    </w:p>
-    <w:p>
-      <w:pPr>
-        <w:spacing w:after="40"/>
-      </w:pPr>
-      <w:r>
-        <w:rPr>
-          <w:rFonts w:ascii="Noto Sans CJK TC" w:hAnsi="Noto Sans CJK TC" w:eastAsia="Noto Sans CJK TC"/>
-          <w:b/>
-          <w:i w:val="0"/>
-          <w:color w:val="111111"/>
-          <w:sz w:val="19"/>
-        </w:rPr>
         <w:t xml:space="preserve">框架: </w:t>
       </w:r>
       <w:r>
@@ -1520,7 +1391,7 @@
           <w:color w:val="111111"/>
           <w:sz w:val="19"/>
         </w:rPr>
-        <w:t>Microsoft Office、AWS CLI（register-task-definition、create-service、update-service、logs tail）、Docker（node:20-slim image with ffmpeg、--no-cache builds）</w:t>
+        <w:t>AWS CLI、Docker</w:t>
       </w:r>
     </w:p>
     <w:p>

</xml_diff>

<commit_message>
Publish output/zh/resume.docx (run 20260828T083324Z-manual)
</commit_message>
<xml_diff>
--- a/output/zh/resume.docx
+++ b/output/zh/resume.docx
@@ -796,7 +796,7 @@
           <w:color w:val="111111"/>
           <w:sz w:val="19"/>
         </w:rPr>
-        <w:t>開發 Slack bot，將 mp4 口頭工作報告轉換為可確認的 Notion 頁面與任務，並每日自動產出 standup 摘要</w:t>
+        <w:t>開發 Slack bot，將 mp4 口頭工作報告轉為可確認的 Notion 頁面與任務，並自動產出每日 standup 摘要</w:t>
       </w:r>
     </w:p>
     <w:p>
@@ -848,7 +848,7 @@
           <w:color w:val="111111"/>
           <w:sz w:val="19"/>
         </w:rPr>
-        <w:t>以維運成本與 private subnet 條件評估 Lambda + API Gateway、自管 EC2 與 App Runner，並與 ECS Fargate 比較</w:t>
+        <w:t>以維運成本與 private subnet 條件，評比 Lambda + API Gateway、自管 EC2、App Runner 與 ECS Fargate</w:t>
       </w:r>
     </w:p>
     <w:p>

</xml_diff>

<commit_message>
Publish output/zh/resume.docx (run 20260828T090338Z-manual)
</commit_message>
<xml_diff>
--- a/output/zh/resume.docx
+++ b/output/zh/resume.docx
@@ -796,7 +796,7 @@
           <w:color w:val="111111"/>
           <w:sz w:val="19"/>
         </w:rPr>
-        <w:t>開發 Slack bot，將 mp4 口頭工作報告轉為可確認的 Notion 頁面與任務，並自動產出每日 standup 摘要</w:t>
+        <w:t>開發 Slack bot，將 mp4 口頭工作報告轉換為可確認的 Notion 頁面與任務，並自動產出每日 standup 摘要。</w:t>
       </w:r>
     </w:p>
     <w:p>
@@ -822,7 +822,7 @@
           <w:color w:val="111111"/>
           <w:sz w:val="19"/>
         </w:rPr>
-        <w:t>將單一實例的 Next.js 服務重新架構為雲原生 ECS Fargate 部署，搭配 DynamoDB、SQS 與 EventBridge，實現水平擴展與零資料遺失的滾動更新</w:t>
+        <w:t>將單一實例的 Next.js 服務重新架構為雲原生 ECS Fargate 部署，搭配 DynamoDB、SQS 與 EventBridge，實現水平擴展與零資料遺失的滾動更新。</w:t>
       </w:r>
     </w:p>
     <w:p>
@@ -848,7 +848,7 @@
           <w:color w:val="111111"/>
           <w:sz w:val="19"/>
         </w:rPr>
-        <w:t>以維運成本與 private subnet 條件，評比 Lambda + API Gateway、自管 EC2、App Runner 與 ECS Fargate</w:t>
+        <w:t>以維運成本與 private subnet 條件為評估標準，比較 Lambda + API Gateway、自管 EC2、App Runner 與 ECS Fargate。</w:t>
       </w:r>
     </w:p>
     <w:p>

</xml_diff>